<commit_message>
docs(dvc): tai lieu API tich hop DVC 1.2
- org-units: province_code la tinh suy ra theo cay don vi, them claim_intake_only,
  mac dinh chi tra don vi dang hoat dong va con hieu luc.
- ping: phong bi chuan, data.server_time.
- Tra trang thai: khoi data.progress (trang thai ho so, van ban da ban hanh).
- Ghi chu: thong bao trang thai chu dong BTNN -> DVC cho chot thong tin.
- Them ca kiem thu 16-18; xuat lai ban Word.

Co-Authored-By: Claude Opus 5.5 <noreply@anthropic.com>
</commit_message>
<xml_diff>
--- a/Tai_lieu_tich_hop/1. Dịch vụ công/Tai_lieu_API_tich_hop_DVC_BTNN.docx
+++ b/Tai_lieu_tich_hop/1. Dịch vụ công/Tai_lieu_API_tich_hop_DVC_BTNN.docx
@@ -88,7 +88,7 @@
               <w:rPr>
                 <w:sz w:val="20"/>
               </w:rPr>
-              <w:t>1.1</w:t>
+              <w:t>1.2</w:t>
             </w:r>
           </w:p>
         </w:tc>
@@ -535,6 +535,125 @@
           </w:p>
         </w:tc>
       </w:tr>
+      <w:tr>
+        <w:tc>
+          <w:tcPr>
+            <w:tcW w:w="1125" w:type="dxa"/>
+          </w:tcPr>
+          <w:p>
+            <w:r>
+              <w:rPr>
+                <w:sz w:val="20"/>
+              </w:rPr>
+              <w:t>1.2</w:t>
+            </w:r>
+          </w:p>
+        </w:tc>
+        <w:tc>
+          <w:tcPr>
+            <w:tcW w:w="1393" w:type="dxa"/>
+          </w:tcPr>
+          <w:p>
+            <w:r>
+              <w:rPr>
+                <w:sz w:val="20"/>
+              </w:rPr>
+              <w:t>29/10/2026</w:t>
+            </w:r>
+          </w:p>
+        </w:tc>
+        <w:tc>
+          <w:tcPr>
+            <w:tcW w:w="7170" w:type="dxa"/>
+          </w:tcPr>
+          <w:p>
+            <w:r>
+              <w:rPr>
+                <w:rFonts w:ascii="Consolas" w:hAnsi="Consolas" w:eastAsia="Consolas"/>
+                <w:color w:val="A31515"/>
+                <w:sz w:val="20"/>
+              </w:rPr>
+              <w:t>org-units</w:t>
+            </w:r>
+            <w:r>
+              <w:rPr>
+                <w:sz w:val="20"/>
+              </w:rPr>
+              <w:t xml:space="preserve">: </w:t>
+            </w:r>
+            <w:r>
+              <w:rPr>
+                <w:rFonts w:ascii="Consolas" w:hAnsi="Consolas" w:eastAsia="Consolas"/>
+                <w:color w:val="A31515"/>
+                <w:sz w:val="20"/>
+              </w:rPr>
+              <w:t>province_code</w:t>
+            </w:r>
+            <w:r>
+              <w:rPr>
+                <w:sz w:val="20"/>
+              </w:rPr>
+              <w:t xml:space="preserve"> là tỉnh suy ra theo cây đơn vị, thêm tham số </w:t>
+            </w:r>
+            <w:r>
+              <w:rPr>
+                <w:rFonts w:ascii="Consolas" w:hAnsi="Consolas" w:eastAsia="Consolas"/>
+                <w:color w:val="A31515"/>
+                <w:sz w:val="20"/>
+              </w:rPr>
+              <w:t>claim_intake_only</w:t>
+            </w:r>
+            <w:r>
+              <w:rPr>
+                <w:sz w:val="20"/>
+              </w:rPr>
+              <w:t xml:space="preserve">, mặc định chỉ trả đơn vị còn hiệu lực; </w:t>
+            </w:r>
+            <w:r>
+              <w:rPr>
+                <w:rFonts w:ascii="Consolas" w:hAnsi="Consolas" w:eastAsia="Consolas"/>
+                <w:color w:val="A31515"/>
+                <w:sz w:val="20"/>
+              </w:rPr>
+              <w:t>ping</w:t>
+            </w:r>
+            <w:r>
+              <w:rPr>
+                <w:sz w:val="20"/>
+              </w:rPr>
+              <w:t xml:space="preserve"> trả phong bì chuẩn kèm </w:t>
+            </w:r>
+            <w:r>
+              <w:rPr>
+                <w:rFonts w:ascii="Consolas" w:hAnsi="Consolas" w:eastAsia="Consolas"/>
+                <w:color w:val="A31515"/>
+                <w:sz w:val="20"/>
+              </w:rPr>
+              <w:t>data.server_time</w:t>
+            </w:r>
+            <w:r>
+              <w:rPr>
+                <w:sz w:val="20"/>
+              </w:rPr>
+              <w:t xml:space="preserve">; API tra trạng thái thêm khối </w:t>
+            </w:r>
+            <w:r>
+              <w:rPr>
+                <w:rFonts w:ascii="Consolas" w:hAnsi="Consolas" w:eastAsia="Consolas"/>
+                <w:color w:val="A31515"/>
+                <w:sz w:val="20"/>
+              </w:rPr>
+              <w:t>data.progress</w:t>
+            </w:r>
+            <w:r>
+              <w:rPr>
+                <w:sz w:val="20"/>
+              </w:rPr>
+              <w:t xml:space="preserve"> (trạng thái hồ sơ và văn bản đã ban hành); thêm ca kiểm thử 16-18</w:t>
+            </w:r>
+          </w:p>
+        </w:tc>
+      </w:tr>
     </w:tbl>
     <w:p>
       <w:pPr>
@@ -591,7 +710,7 @@
         <w:t>Tiếp nhận hồ sơ</w:t>
       </w:r>
       <w:r>
-        <w:t xml:space="preserve"> của Cơ quan giải quyết bồi thường. DVC tra được trạng thái xử lý.</w:t>
+        <w:t xml:space="preserve"> của Cơ quan giải quyết bồi thường. DVC tra được trạng thái xử lý và tiến độ giải quyết (trạng thái hồ sơ, các văn bản đã ban hành).</w:t>
       </w:r>
     </w:p>
     <w:p>
@@ -751,6 +870,11 @@
     <w:p>
       <w:r>
         <w:t>Mọi dữ liệu trao đổi là JSON, mã hóa UTF-8, qua HTTPS.</w:t>
+      </w:r>
+    </w:p>
+    <w:p>
+      <w:r>
+        <w:t>Thông báo trạng thái chủ động từ BTNN sang DVC: chờ chốt thông tin với DVC; hiện DVC tra trạng thái và tiến độ qua API tra trạng thái (mục 7.8).</w:t>
       </w:r>
     </w:p>
     <w:p>
@@ -1108,9 +1232,9 @@
       </w:tblPr>
       <w:tblGrid>
         <w:gridCol w:w="900"/>
-        <w:gridCol w:w="3742"/>
+        <w:gridCol w:w="3666"/>
         <w:gridCol w:w="900"/>
-        <w:gridCol w:w="4146"/>
+        <w:gridCol w:w="4222"/>
       </w:tblGrid>
       <w:tr>
         <w:trPr>
@@ -1133,7 +1257,7 @@
         </w:tc>
         <w:tc>
           <w:tcPr>
-            <w:tcW w:w="3742" w:type="dxa"/>
+            <w:tcW w:w="3666" w:type="dxa"/>
             <w:shd w:val="clear" w:color="auto" w:fill="DCE6F2"/>
           </w:tcPr>
           <w:p>
@@ -1163,7 +1287,7 @@
         </w:tc>
         <w:tc>
           <w:tcPr>
-            <w:tcW w:w="4146" w:type="dxa"/>
+            <w:tcW w:w="4222" w:type="dxa"/>
             <w:shd w:val="clear" w:color="auto" w:fill="DCE6F2"/>
           </w:tcPr>
           <w:p>
@@ -1193,14 +1317,28 @@
         </w:tc>
         <w:tc>
           <w:tcPr>
-            <w:tcW w:w="3742" w:type="dxa"/>
-          </w:tcPr>
-          <w:p>
-            <w:r>
-              <w:rPr>
-                <w:sz w:val="20"/>
-              </w:rPr>
-              <w:t xml:space="preserve">Chuẩn bị: DVC gửi IP máy chủ gọi API và đầu mối kỹ thuật. BTNN khai IP, cấp các mã API (mục 2 và 6), gửi client secret + khóa HMAC, báo danh sách Cơ quan giải quyết đã có Luồng tiếp nhận hồ sơ "Giải quyết yêu cầu bồi thường" để DVC dùng khi gửi thử (cơ quan chưa có luồng thì hồ sơ dừng ở </w:t>
+            <w:tcW w:w="3666" w:type="dxa"/>
+          </w:tcPr>
+          <w:p>
+            <w:r>
+              <w:rPr>
+                <w:sz w:val="20"/>
+              </w:rPr>
+              <w:t xml:space="preserve">Chuẩn bị: DVC gửi IP máy chủ gọi API và đầu mối kỹ thuật. BTNN khai IP, cấp các mã API (mục 2 và 6), gửi client secret + khóa HMAC. Cơ quan đã có Luồng tiếp nhận hồ sơ "Giải quyết yêu cầu bồi thường" lấy bằng </w:t>
+            </w:r>
+            <w:r>
+              <w:rPr>
+                <w:rFonts w:ascii="Consolas" w:hAnsi="Consolas" w:eastAsia="Consolas"/>
+                <w:color w:val="A31515"/>
+                <w:sz w:val="20"/>
+              </w:rPr>
+              <w:t>org-units?claim_intake_only=true</w:t>
+            </w:r>
+            <w:r>
+              <w:rPr>
+                <w:sz w:val="20"/>
+              </w:rPr>
+              <w:t xml:space="preserve"> (mục 6.4); cơ quan chưa có luồng thì hồ sơ dừng ở </w:t>
             </w:r>
             <w:r>
               <w:rPr>
@@ -1214,7 +1352,7 @@
               <w:rPr>
                 <w:sz w:val="20"/>
               </w:rPr>
-              <w:t>, mục 7.8)</w:t>
+              <w:t xml:space="preserve"> (mục 7.8)</w:t>
             </w:r>
           </w:p>
         </w:tc>
@@ -1233,7 +1371,7 @@
         </w:tc>
         <w:tc>
           <w:tcPr>
-            <w:tcW w:w="4146" w:type="dxa"/>
+            <w:tcW w:w="4222" w:type="dxa"/>
           </w:tcPr>
           <w:p>
             <w:r>
@@ -1261,7 +1399,7 @@
         </w:tc>
         <w:tc>
           <w:tcPr>
-            <w:tcW w:w="3742" w:type="dxa"/>
+            <w:tcW w:w="3666" w:type="dxa"/>
           </w:tcPr>
           <w:p>
             <w:r>
@@ -1287,7 +1425,7 @@
         </w:tc>
         <w:tc>
           <w:tcPr>
-            <w:tcW w:w="4146" w:type="dxa"/>
+            <w:tcW w:w="4222" w:type="dxa"/>
           </w:tcPr>
           <w:p>
             <w:r>
@@ -1323,7 +1461,7 @@
         </w:tc>
         <w:tc>
           <w:tcPr>
-            <w:tcW w:w="3742" w:type="dxa"/>
+            <w:tcW w:w="3666" w:type="dxa"/>
           </w:tcPr>
           <w:p>
             <w:r>
@@ -1363,14 +1501,28 @@
         </w:tc>
         <w:tc>
           <w:tcPr>
-            <w:tcW w:w="4146" w:type="dxa"/>
-          </w:tcPr>
-          <w:p>
-            <w:r>
-              <w:rPr>
-                <w:sz w:val="20"/>
-              </w:rPr>
-              <w:t>HTTP 200. Lỗi thì đối chiếu bảng mục 8</w:t>
+            <w:tcW w:w="4222" w:type="dxa"/>
+          </w:tcPr>
+          <w:p>
+            <w:r>
+              <w:rPr>
+                <w:sz w:val="20"/>
+              </w:rPr>
+              <w:t xml:space="preserve">HTTP 200, có </w:t>
+            </w:r>
+            <w:r>
+              <w:rPr>
+                <w:rFonts w:ascii="Consolas" w:hAnsi="Consolas" w:eastAsia="Consolas"/>
+                <w:color w:val="A31515"/>
+                <w:sz w:val="20"/>
+              </w:rPr>
+              <w:t>data.server_time</w:t>
+            </w:r>
+            <w:r>
+              <w:rPr>
+                <w:sz w:val="20"/>
+              </w:rPr>
+              <w:t>. Lỗi thì đối chiếu bảng mục 8</w:t>
             </w:r>
           </w:p>
         </w:tc>
@@ -1391,7 +1543,7 @@
         </w:tc>
         <w:tc>
           <w:tcPr>
-            <w:tcW w:w="3742" w:type="dxa"/>
+            <w:tcW w:w="3666" w:type="dxa"/>
           </w:tcPr>
           <w:p>
             <w:r>
@@ -1425,7 +1577,7 @@
         </w:tc>
         <w:tc>
           <w:tcPr>
-            <w:tcW w:w="4146" w:type="dxa"/>
+            <w:tcW w:w="4222" w:type="dxa"/>
           </w:tcPr>
           <w:p>
             <w:r>
@@ -1453,7 +1605,7 @@
         </w:tc>
         <w:tc>
           <w:tcPr>
-            <w:tcW w:w="3742" w:type="dxa"/>
+            <w:tcW w:w="3666" w:type="dxa"/>
           </w:tcPr>
           <w:p>
             <w:r>
@@ -1474,7 +1626,29 @@
               <w:rPr>
                 <w:sz w:val="20"/>
               </w:rPr>
-              <w:t>, gắn từng ô với danh mục tương ứng và áp đúng quy tắc lọc (mục 6.6)</w:t>
+              <w:t xml:space="preserve">, gắn từng ô với danh mục tương ứng và áp đúng quy tắc lọc (mục 6.6); ô Cơ quan giải quyết dùng </w:t>
+            </w:r>
+            <w:r>
+              <w:rPr>
+                <w:rFonts w:ascii="Consolas" w:hAnsi="Consolas" w:eastAsia="Consolas"/>
+                <w:color w:val="A31515"/>
+                <w:sz w:val="20"/>
+              </w:rPr>
+              <w:t>province_code</w:t>
+            </w:r>
+            <w:r>
+              <w:rPr>
+                <w:sz w:val="20"/>
+              </w:rPr>
+              <w:t xml:space="preserve"> + </w:t>
+            </w:r>
+            <w:r>
+              <w:rPr>
+                <w:rFonts w:ascii="Consolas" w:hAnsi="Consolas" w:eastAsia="Consolas"/>
+                <w:color w:val="A31515"/>
+                <w:sz w:val="20"/>
+              </w:rPr>
+              <w:t>claim_intake_only=true</w:t>
             </w:r>
           </w:p>
         </w:tc>
@@ -1493,7 +1667,7 @@
         </w:tc>
         <w:tc>
           <w:tcPr>
-            <w:tcW w:w="4146" w:type="dxa"/>
+            <w:tcW w:w="4222" w:type="dxa"/>
           </w:tcPr>
           <w:p>
             <w:r>
@@ -1521,7 +1695,7 @@
         </w:tc>
         <w:tc>
           <w:tcPr>
-            <w:tcW w:w="3742" w:type="dxa"/>
+            <w:tcW w:w="3666" w:type="dxa"/>
           </w:tcPr>
           <w:p>
             <w:r>
@@ -1561,7 +1735,7 @@
         </w:tc>
         <w:tc>
           <w:tcPr>
-            <w:tcW w:w="4146" w:type="dxa"/>
+            <w:tcW w:w="4222" w:type="dxa"/>
           </w:tcPr>
           <w:p>
             <w:r>
@@ -1589,7 +1763,7 @@
         </w:tc>
         <w:tc>
           <w:tcPr>
-            <w:tcW w:w="3742" w:type="dxa"/>
+            <w:tcW w:w="3666" w:type="dxa"/>
           </w:tcPr>
           <w:p>
             <w:r>
@@ -1615,7 +1789,7 @@
         </w:tc>
         <w:tc>
           <w:tcPr>
-            <w:tcW w:w="4146" w:type="dxa"/>
+            <w:tcW w:w="4222" w:type="dxa"/>
           </w:tcPr>
           <w:p>
             <w:r>
@@ -1643,7 +1817,7 @@
         </w:tc>
         <w:tc>
           <w:tcPr>
-            <w:tcW w:w="3742" w:type="dxa"/>
+            <w:tcW w:w="3666" w:type="dxa"/>
           </w:tcPr>
           <w:p>
             <w:r>
@@ -1669,14 +1843,28 @@
         </w:tc>
         <w:tc>
           <w:tcPr>
-            <w:tcW w:w="4146" w:type="dxa"/>
-          </w:tcPr>
-          <w:p>
-            <w:r>
-              <w:rPr>
-                <w:sz w:val="20"/>
-              </w:rPr>
-              <w:t>Gửi lại không tạo hồ sơ trùng; hiển thị được trạng thái cho người nộp</w:t>
+            <w:tcW w:w="4222" w:type="dxa"/>
+          </w:tcPr>
+          <w:p>
+            <w:r>
+              <w:rPr>
+                <w:sz w:val="20"/>
+              </w:rPr>
+              <w:t>Gửi lại không tạo hồ sơ trùng; hiển thị được trạng thái và tiến độ (</w:t>
+            </w:r>
+            <w:r>
+              <w:rPr>
+                <w:rFonts w:ascii="Consolas" w:hAnsi="Consolas" w:eastAsia="Consolas"/>
+                <w:color w:val="A31515"/>
+                <w:sz w:val="20"/>
+              </w:rPr>
+              <w:t>data.progress</w:t>
+            </w:r>
+            <w:r>
+              <w:rPr>
+                <w:sz w:val="20"/>
+              </w:rPr>
+              <w:t>) cho người nộp</w:t>
             </w:r>
           </w:p>
         </w:tc>
@@ -1697,7 +1885,7 @@
         </w:tc>
         <w:tc>
           <w:tcPr>
-            <w:tcW w:w="3742" w:type="dxa"/>
+            <w:tcW w:w="3666" w:type="dxa"/>
           </w:tcPr>
           <w:p>
             <w:r>
@@ -1723,7 +1911,7 @@
         </w:tc>
         <w:tc>
           <w:tcPr>
-            <w:tcW w:w="4146" w:type="dxa"/>
+            <w:tcW w:w="4222" w:type="dxa"/>
           </w:tcPr>
           <w:p>
             <w:r>
@@ -4145,7 +4333,51 @@
         <w:t>GET /api/share/v1/partner/ping</w:t>
       </w:r>
       <w:r>
-        <w:t xml:space="preserve"> - trả HTTP 200 khi token, chữ ký, IP và mã đối tác đều đúng. Đây là bước 3 của mục 3.</w:t>
+        <w:t xml:space="preserve"> - trả HTTP 200 khi token, chữ ký, IP và mã đối tác đều đúng. Đây là bước 3 của mục 3. Không cần được cấp mã API riêng. Phản hồi theo khuôn chuẩn của cổng (mục 6.3), </w:t>
+      </w:r>
+      <w:r>
+        <w:rPr>
+          <w:rFonts w:ascii="Consolas" w:hAnsi="Consolas" w:eastAsia="Consolas"/>
+          <w:color w:val="A31515"/>
+        </w:rPr>
+        <w:t>data.server_time</w:t>
+      </w:r>
+      <w:r>
+        <w:t xml:space="preserve"> là giờ máy chủ BTNN (+07:00), dùng để đối chiếu giờ máy DVC (</w:t>
+      </w:r>
+      <w:r>
+        <w:rPr>
+          <w:rFonts w:ascii="Consolas" w:hAnsi="Consolas" w:eastAsia="Consolas"/>
+          <w:color w:val="A31515"/>
+        </w:rPr>
+        <w:t>X-Timestamp</w:t>
+      </w:r>
+      <w:r>
+        <w:t xml:space="preserve"> lệch quá 5 phút bị 401 </w:t>
+      </w:r>
+      <w:r>
+        <w:rPr>
+          <w:rFonts w:ascii="Consolas" w:hAnsi="Consolas" w:eastAsia="Consolas"/>
+          <w:color w:val="A31515"/>
+        </w:rPr>
+        <w:t>TIMESTAMP_INVALID</w:t>
+      </w:r>
+      <w:r>
+        <w:t>):</w:t>
+      </w:r>
+    </w:p>
+    <w:p>
+      <w:pPr>
+        <w:shd w:val="clear" w:color="auto" w:fill="F2F4F7"/>
+        <w:spacing w:after="0" w:before="0"/>
+        <w:ind w:left="170"/>
+      </w:pPr>
+      <w:r>
+        <w:rPr>
+          <w:rFonts w:ascii="Consolas" w:hAnsi="Consolas" w:eastAsia="Consolas"/>
+          <w:sz w:val="17"/>
+        </w:rPr>
+        <w:t>{ "code": "SUCCESS", "message": null, "data": { "server_time": "2026-10-29T10:00:00+07:00" } }</w:t>
       </w:r>
     </w:p>
     <w:p>
@@ -5044,7 +5276,7 @@
               <w:rPr>
                 <w:sz w:val="20"/>
               </w:rPr>
-              <w:t>Lọc theo Tỉnh/Thành phố (mục 6.4)</w:t>
+              <w:t>Lọc theo Tỉnh/Thành phố và chỉ lấy cơ quan đã có Luồng tiếp nhận (mục 6.4)</w:t>
             </w:r>
           </w:p>
         </w:tc>
@@ -6422,10 +6654,10 @@
           <w:rFonts w:ascii="Consolas" w:hAnsi="Consolas" w:eastAsia="Consolas"/>
           <w:color w:val="A31515"/>
         </w:rPr>
-        <w:t>GET /api/share/v1/org-units?province_code=&lt;mã tỉnh&gt;</w:t>
-      </w:r>
-      <w:r>
-        <w:t xml:space="preserve">: danh sách đơn vị trong Cơ cấu tổ chức thuộc tỉnh đã chọn. </w:t>
+        <w:t>GET /api/share/v1/org-units</w:t>
+      </w:r>
+      <w:r>
+        <w:t xml:space="preserve">: danh sách đơn vị trong Cơ cấu tổ chức. </w:t>
       </w:r>
       <w:r>
         <w:rPr>
@@ -6445,265 +6677,41 @@
         <w:t>agency.agency_code</w:t>
       </w:r>
       <w:r>
-        <w:t xml:space="preserve"> khi nộp hồ sơ. Tham số lọc thêm: </w:t>
+        <w:t xml:space="preserve"> khi nộp hồ sơ. Để dựng ô Cơ quan giải quyết, DVC gọi với </w:t>
       </w:r>
       <w:r>
         <w:rPr>
           <w:rFonts w:ascii="Consolas" w:hAnsi="Consolas" w:eastAsia="Consolas"/>
           <w:color w:val="A31515"/>
         </w:rPr>
-        <w:t>unit_level</w:t>
-      </w:r>
-      <w:r>
-        <w:t xml:space="preserve"> (</w:t>
+        <w:t>province_code</w:t>
+      </w:r>
+      <w:r>
+        <w:t xml:space="preserve"> + </w:t>
       </w:r>
       <w:r>
         <w:rPr>
           <w:rFonts w:ascii="Consolas" w:hAnsi="Consolas" w:eastAsia="Consolas"/>
           <w:color w:val="A31515"/>
         </w:rPr>
-        <w:t>CENTRAL</w:t>
-      </w:r>
-      <w:r>
-        <w:t xml:space="preserve">, </w:t>
-      </w:r>
-      <w:r>
-        <w:rPr>
-          <w:rFonts w:ascii="Consolas" w:hAnsi="Consolas" w:eastAsia="Consolas"/>
-          <w:color w:val="A31515"/>
-        </w:rPr>
-        <w:t>PROVINCE</w:t>
-      </w:r>
-      <w:r>
-        <w:t xml:space="preserve">, </w:t>
-      </w:r>
-      <w:r>
-        <w:rPr>
-          <w:rFonts w:ascii="Consolas" w:hAnsi="Consolas" w:eastAsia="Consolas"/>
-          <w:color w:val="A31515"/>
-        </w:rPr>
-        <w:t>WARD</w:t>
-      </w:r>
-      <w:r>
-        <w:t xml:space="preserve">, </w:t>
-      </w:r>
-      <w:r>
-        <w:rPr>
-          <w:rFonts w:ascii="Consolas" w:hAnsi="Consolas" w:eastAsia="Consolas"/>
-          <w:color w:val="A31515"/>
-        </w:rPr>
-        <w:t>DEPARTMENT</w:t>
-      </w:r>
-      <w:r>
-        <w:t xml:space="preserve">, </w:t>
-      </w:r>
-      <w:r>
-        <w:rPr>
-          <w:rFonts w:ascii="Consolas" w:hAnsi="Consolas" w:eastAsia="Consolas"/>
-          <w:color w:val="A31515"/>
-        </w:rPr>
-        <w:t>DISTRICT</w:t>
-      </w:r>
-      <w:r>
-        <w:t xml:space="preserve">), </w:t>
-      </w:r>
-      <w:r>
-        <w:rPr>
-          <w:rFonts w:ascii="Consolas" w:hAnsi="Consolas" w:eastAsia="Consolas"/>
-          <w:color w:val="A31515"/>
-        </w:rPr>
-        <w:t>unit_type</w:t>
-      </w:r>
-      <w:r>
-        <w:t xml:space="preserve"> (</w:t>
-      </w:r>
-      <w:r>
-        <w:rPr>
-          <w:rFonts w:ascii="Consolas" w:hAnsi="Consolas" w:eastAsia="Consolas"/>
-          <w:color w:val="A31515"/>
-        </w:rPr>
-        <w:t>INTERNAL</w:t>
-      </w:r>
-      <w:r>
-        <w:t xml:space="preserve">, </w:t>
-      </w:r>
-      <w:r>
-        <w:rPr>
-          <w:rFonts w:ascii="Consolas" w:hAnsi="Consolas" w:eastAsia="Consolas"/>
-          <w:color w:val="A31515"/>
-        </w:rPr>
-        <w:t>EXTERNAL</w:t>
-      </w:r>
-      <w:r>
-        <w:t xml:space="preserve">), </w:t>
-      </w:r>
-      <w:r>
-        <w:rPr>
-          <w:rFonts w:ascii="Consolas" w:hAnsi="Consolas" w:eastAsia="Consolas"/>
-          <w:color w:val="A31515"/>
-        </w:rPr>
-        <w:t>org_type</w:t>
-      </w:r>
-      <w:r>
-        <w:t xml:space="preserve"> (mã danh mục DM_57). Trường trả về: </w:t>
-      </w:r>
-      <w:r>
-        <w:rPr>
-          <w:rFonts w:ascii="Consolas" w:hAnsi="Consolas" w:eastAsia="Consolas"/>
-          <w:color w:val="A31515"/>
-        </w:rPr>
-        <w:t>id, code, name, short_name, parent_id, parent_code, depth, has_children, unit_type, unit_level, org_type, province_code, ward_code, address, phone, email, tax_code, sort_order, effective_from, effective_to, is_active, is_deleted, created_at, updated_at</w:t>
-      </w:r>
-      <w:r>
-        <w:t>.</w:t>
+        <w:t>claim_intake_only=true</w:t>
+      </w:r>
+      <w:r>
+        <w:t>:</w:t>
       </w:r>
     </w:p>
     <w:p>
       <w:pPr>
-        <w:pStyle w:val="Heading2"/>
-      </w:pPr>
-      <w:r>
-        <w:t>6.5. Đồng bộ tăng dần</w:t>
-      </w:r>
-    </w:p>
-    <w:p>
-      <w:pPr>
-        <w:pStyle w:val="ListNumber"/>
-        <w:numPr>
-          <w:ilvl w:val="0"/>
-          <w:numId w:val="11"/>
-        </w:numPr>
-      </w:pPr>
-      <w:r>
-        <w:t xml:space="preserve">Lần đầu: gọi không có </w:t>
-      </w:r>
+        <w:shd w:val="clear" w:color="auto" w:fill="F2F4F7"/>
+        <w:spacing w:after="0" w:before="0"/>
+        <w:ind w:left="170"/>
+      </w:pPr>
       <w:r>
         <w:rPr>
           <w:rFonts w:ascii="Consolas" w:hAnsi="Consolas" w:eastAsia="Consolas"/>
-          <w:color w:val="A31515"/>
-        </w:rPr>
-        <w:t>last_sync_time</w:t>
-      </w:r>
-      <w:r>
-        <w:t>, đi hết các trang (</w:t>
-      </w:r>
-      <w:r>
-        <w:rPr>
-          <w:rFonts w:ascii="Consolas" w:hAnsi="Consolas" w:eastAsia="Consolas"/>
-          <w:color w:val="A31515"/>
-        </w:rPr>
-        <w:t>has_more=false</w:t>
-      </w:r>
-      <w:r>
-        <w:t xml:space="preserve"> là hết). Giữ </w:t>
-      </w:r>
-      <w:r>
-        <w:rPr>
-          <w:rFonts w:ascii="Consolas" w:hAnsi="Consolas" w:eastAsia="Consolas"/>
-          <w:color w:val="A31515"/>
-        </w:rPr>
-        <w:t>server_time</w:t>
-      </w:r>
-      <w:r>
-        <w:t xml:space="preserve"> của </w:t>
-      </w:r>
-      <w:r>
-        <w:rPr>
-          <w:b/>
-        </w:rPr>
-        <w:t>trang đầu tiên</w:t>
-      </w:r>
-      <w:r>
-        <w:t>.</w:t>
-      </w:r>
-    </w:p>
-    <w:p>
-      <w:pPr>
-        <w:pStyle w:val="ListNumber"/>
-        <w:numPr>
-          <w:ilvl w:val="0"/>
-          <w:numId w:val="11"/>
-        </w:numPr>
-      </w:pPr>
-      <w:r>
-        <w:t xml:space="preserve">Các lần sau: gọi với </w:t>
-      </w:r>
-      <w:r>
-        <w:rPr>
-          <w:rFonts w:ascii="Consolas" w:hAnsi="Consolas" w:eastAsia="Consolas"/>
-          <w:color w:val="A31515"/>
-        </w:rPr>
-        <w:t>last_sync_time</w:t>
-      </w:r>
-      <w:r>
-        <w:t xml:space="preserve"> = </w:t>
-      </w:r>
-      <w:r>
-        <w:rPr>
-          <w:rFonts w:ascii="Consolas" w:hAnsi="Consolas" w:eastAsia="Consolas"/>
-          <w:color w:val="A31515"/>
-        </w:rPr>
-        <w:t>server_time</w:t>
-      </w:r>
-      <w:r>
-        <w:t xml:space="preserve"> đã giữ (nên lùi vài phút, vd 5 phút), đi hết các trang, </w:t>
-      </w:r>
-      <w:r>
-        <w:rPr>
-          <w:b/>
-        </w:rPr>
-        <w:t xml:space="preserve">cập nhật/thêm theo </w:t>
-      </w:r>
-      <w:r>
-        <w:rPr>
-          <w:rFonts w:ascii="Consolas" w:hAnsi="Consolas" w:eastAsia="Consolas"/>
-          <w:b/>
-          <w:color w:val="A31515"/>
-        </w:rPr>
-        <w:t>id</w:t>
-      </w:r>
-      <w:r>
-        <w:t xml:space="preserve">; bản ghi </w:t>
-      </w:r>
-      <w:r>
-        <w:rPr>
-          <w:rFonts w:ascii="Consolas" w:hAnsi="Consolas" w:eastAsia="Consolas"/>
-          <w:color w:val="A31515"/>
-        </w:rPr>
-        <w:t>is_deleted=true</w:t>
-      </w:r>
-      <w:r>
-        <w:t xml:space="preserve"> thì xóa, </w:t>
-      </w:r>
-      <w:r>
-        <w:rPr>
-          <w:rFonts w:ascii="Consolas" w:hAnsi="Consolas" w:eastAsia="Consolas"/>
-          <w:color w:val="A31515"/>
-        </w:rPr>
-        <w:t>is_active=false</w:t>
-      </w:r>
-      <w:r>
-        <w:t xml:space="preserve"> thì ẩn khỏi E-Form.</w:t>
-      </w:r>
-    </w:p>
-    <w:p>
-      <w:pPr>
-        <w:pStyle w:val="ListNumber"/>
-        <w:numPr>
-          <w:ilvl w:val="0"/>
-          <w:numId w:val="11"/>
-        </w:numPr>
-      </w:pPr>
-      <w:r>
-        <w:t>Chỉ cập nhật mốc sau khi đi hết các trang thành công.</w:t>
-      </w:r>
-    </w:p>
-    <w:p>
-      <w:pPr>
-        <w:pStyle w:val="Heading2"/>
-      </w:pPr>
-      <w:r>
-        <w:t>6.6. Quy tắc dùng danh mục trên E-Form</w:t>
+          <w:sz w:val="17"/>
+        </w:rPr>
+        <w:t>GET /api/share/v1/org-units?province_code=01&amp;claim_intake_only=true</w:t>
       </w:r>
     </w:p>
     <w:tbl>
@@ -6715,8 +6723,8 @@
         <w:tblLook w:firstColumn="1" w:firstRow="1" w:lastColumn="0" w:lastRow="0" w:noHBand="0" w:noVBand="1" w:val="04A0"/>
       </w:tblPr>
       <w:tblGrid>
-        <w:gridCol w:w="3232"/>
-        <w:gridCol w:w="6456"/>
+        <w:gridCol w:w="2430"/>
+        <w:gridCol w:w="7258"/>
       </w:tblGrid>
       <w:tr>
         <w:trPr>
@@ -6724,7 +6732,7 @@
         </w:trPr>
         <w:tc>
           <w:tcPr>
-            <w:tcW w:w="3232" w:type="dxa"/>
+            <w:tcW w:w="2430" w:type="dxa"/>
             <w:shd w:val="clear" w:color="auto" w:fill="DCE6F2"/>
           </w:tcPr>
           <w:p>
@@ -6733,13 +6741,13 @@
                 <w:b/>
                 <w:sz w:val="20"/>
               </w:rPr>
-              <w:t>Ô E-Form</w:t>
-            </w:r>
-          </w:p>
-        </w:tc>
-        <w:tc>
-          <w:tcPr>
-            <w:tcW w:w="6456" w:type="dxa"/>
+              <w:t>Tham số riêng</w:t>
+            </w:r>
+          </w:p>
+        </w:tc>
+        <w:tc>
+          <w:tcPr>
+            <w:tcW w:w="7258" w:type="dxa"/>
             <w:shd w:val="clear" w:color="auto" w:fill="DCE6F2"/>
           </w:tcPr>
           <w:p>
@@ -6748,7 +6756,7 @@
                 <w:b/>
                 <w:sz w:val="20"/>
               </w:rPr>
-              <w:t>Quy tắc</w:t>
+              <w:t>Ý nghĩa</w:t>
             </w:r>
           </w:p>
         </w:tc>
@@ -6756,55 +6764,98 @@
       <w:tr>
         <w:tc>
           <w:tcPr>
-            <w:tcW w:w="3232" w:type="dxa"/>
-          </w:tcPr>
-          <w:p>
-            <w:r>
-              <w:rPr>
-                <w:sz w:val="20"/>
-              </w:rPr>
-              <w:t>Loại giấy tờ thân nhân</w:t>
-            </w:r>
-          </w:p>
-        </w:tc>
-        <w:tc>
-          <w:tcPr>
-            <w:tcW w:w="6456" w:type="dxa"/>
-          </w:tcPr>
-          <w:p>
-            <w:r>
-              <w:rPr>
-                <w:sz w:val="20"/>
-              </w:rPr>
-              <w:t xml:space="preserve">Chỉ hiện giá trị DM_10 có </w:t>
-            </w:r>
-            <w:r>
-              <w:rPr>
-                <w:rFonts w:ascii="Consolas" w:hAnsi="Consolas" w:eastAsia="Consolas"/>
-                <w:color w:val="A31515"/>
-                <w:sz w:val="20"/>
-              </w:rPr>
-              <w:t>use_on_eform</w:t>
-            </w:r>
-            <w:r>
-              <w:rPr>
-                <w:sz w:val="20"/>
-              </w:rPr>
-              <w:t xml:space="preserve"> = </w:t>
-            </w:r>
-            <w:r>
-              <w:rPr>
-                <w:rFonts w:ascii="Consolas" w:hAnsi="Consolas" w:eastAsia="Consolas"/>
-                <w:color w:val="A31515"/>
-                <w:sz w:val="20"/>
-              </w:rPr>
-              <w:t>true</w:t>
-            </w:r>
-            <w:r>
-              <w:rPr>
-                <w:sz w:val="20"/>
-              </w:rPr>
-              <w:t xml:space="preserve"> (không có Mã số thuế)</w:t>
+            <w:tcW w:w="2430" w:type="dxa"/>
+          </w:tcPr>
+          <w:p>
+            <w:r>
+              <w:rPr>
+                <w:rFonts w:ascii="Consolas" w:hAnsi="Consolas" w:eastAsia="Consolas"/>
+                <w:color w:val="A31515"/>
+                <w:sz w:val="20"/>
+              </w:rPr>
+              <w:t>province_code</w:t>
+            </w:r>
+          </w:p>
+        </w:tc>
+        <w:tc>
+          <w:tcPr>
+            <w:tcW w:w="7258" w:type="dxa"/>
+          </w:tcPr>
+          <w:p>
+            <w:r>
+              <w:rPr>
+                <w:sz w:val="20"/>
+              </w:rPr>
+              <w:t xml:space="preserve">Mã Tỉnh/Thành phố: chỉ lấy đơn vị thuộc tỉnh đó. Tỉnh của đơn vị là tỉnh </w:t>
+            </w:r>
+            <w:r>
+              <w:rPr>
+                <w:b/>
+                <w:sz w:val="20"/>
+              </w:rPr>
+              <w:t>suy ra theo cây đơn vị</w:t>
+            </w:r>
+            <w:r>
+              <w:rPr>
+                <w:sz w:val="20"/>
+              </w:rPr>
+              <w:t>: tỉnh khai ở chính đơn vị, không có thì của đơn vị cha gần nhất (tối đa 20 tầng); cơ quan trung ương không khai tỉnh được tính là Hà Nội (</w:t>
+            </w:r>
+            <w:r>
+              <w:rPr>
+                <w:rFonts w:ascii="Consolas" w:hAnsi="Consolas" w:eastAsia="Consolas"/>
+                <w:color w:val="A31515"/>
+                <w:sz w:val="20"/>
+              </w:rPr>
+              <w:t>01</w:t>
+            </w:r>
+            <w:r>
+              <w:rPr>
+                <w:sz w:val="20"/>
+              </w:rPr>
+              <w:t xml:space="preserve">). Đây cũng là quy tắc kiểm </w:t>
+            </w:r>
+            <w:r>
+              <w:rPr>
+                <w:rFonts w:ascii="Consolas" w:hAnsi="Consolas" w:eastAsia="Consolas"/>
+                <w:color w:val="A31515"/>
+                <w:sz w:val="20"/>
+              </w:rPr>
+              <w:t>agency.province_code</w:t>
+            </w:r>
+            <w:r>
+              <w:rPr>
+                <w:sz w:val="20"/>
+              </w:rPr>
+              <w:t xml:space="preserve"> / </w:t>
+            </w:r>
+            <w:r>
+              <w:rPr>
+                <w:rFonts w:ascii="Consolas" w:hAnsi="Consolas" w:eastAsia="Consolas"/>
+                <w:color w:val="A31515"/>
+                <w:sz w:val="20"/>
+              </w:rPr>
+              <w:t>agency.agency_code</w:t>
+            </w:r>
+            <w:r>
+              <w:rPr>
+                <w:sz w:val="20"/>
+              </w:rPr>
+              <w:t xml:space="preserve"> khi nộp hồ sơ: đơn vị có trong danh sách của tỉnh X thì được nhận với </w:t>
+            </w:r>
+            <w:r>
+              <w:rPr>
+                <w:rFonts w:ascii="Consolas" w:hAnsi="Consolas" w:eastAsia="Consolas"/>
+                <w:color w:val="A31515"/>
+                <w:sz w:val="20"/>
+              </w:rPr>
+              <w:t>agency.province_code</w:t>
+            </w:r>
+            <w:r>
+              <w:rPr>
+                <w:sz w:val="20"/>
+              </w:rPr>
+              <w:t xml:space="preserve"> = X, và ngược lại</w:t>
             </w:r>
           </w:p>
         </w:tc>
@@ -6812,50 +6863,24 @@
       <w:tr>
         <w:tc>
           <w:tcPr>
-            <w:tcW w:w="3232" w:type="dxa"/>
-          </w:tcPr>
-          <w:p>
-            <w:r>
-              <w:rPr>
-                <w:sz w:val="20"/>
-              </w:rPr>
-              <w:t>Tư cách người yêu cầu</w:t>
-            </w:r>
-          </w:p>
-        </w:tc>
-        <w:tc>
-          <w:tcPr>
-            <w:tcW w:w="6456" w:type="dxa"/>
-          </w:tcPr>
-          <w:p>
-            <w:r>
-              <w:rPr>
-                <w:rFonts w:ascii="Consolas" w:hAnsi="Consolas" w:eastAsia="Consolas"/>
-                <w:color w:val="A31515"/>
-                <w:sz w:val="20"/>
-              </w:rPr>
-              <w:t>Loại người yêu cầu</w:t>
-            </w:r>
-            <w:r>
-              <w:rPr>
-                <w:sz w:val="20"/>
-              </w:rPr>
-              <w:t xml:space="preserve"> = Cá nhân: giá trị DM_26 có </w:t>
-            </w:r>
-            <w:r>
-              <w:rPr>
-                <w:rFonts w:ascii="Consolas" w:hAnsi="Consolas" w:eastAsia="Consolas"/>
-                <w:color w:val="A31515"/>
-                <w:sz w:val="20"/>
-              </w:rPr>
-              <w:t>for_individual</w:t>
-            </w:r>
-            <w:r>
-              <w:rPr>
-                <w:sz w:val="20"/>
-              </w:rPr>
-              <w:t xml:space="preserve"> = </w:t>
-            </w:r>
+            <w:tcW w:w="2430" w:type="dxa"/>
+          </w:tcPr>
+          <w:p>
+            <w:r>
+              <w:rPr>
+                <w:rFonts w:ascii="Consolas" w:hAnsi="Consolas" w:eastAsia="Consolas"/>
+                <w:color w:val="A31515"/>
+                <w:sz w:val="20"/>
+              </w:rPr>
+              <w:t>claim_intake_only</w:t>
+            </w:r>
+          </w:p>
+        </w:tc>
+        <w:tc>
+          <w:tcPr>
+            <w:tcW w:w="7258" w:type="dxa"/>
+          </w:tcPr>
+          <w:p>
             <w:r>
               <w:rPr>
                 <w:rFonts w:ascii="Consolas" w:hAnsi="Consolas" w:eastAsia="Consolas"/>
@@ -6868,21 +6893,21 @@
               <w:rPr>
                 <w:sz w:val="20"/>
               </w:rPr>
-              <w:t xml:space="preserve">; = Tổ chức: có </w:t>
-            </w:r>
-            <w:r>
-              <w:rPr>
-                <w:rFonts w:ascii="Consolas" w:hAnsi="Consolas" w:eastAsia="Consolas"/>
-                <w:color w:val="A31515"/>
-                <w:sz w:val="20"/>
-              </w:rPr>
-              <w:t>for_organization</w:t>
-            </w:r>
-            <w:r>
-              <w:rPr>
-                <w:sz w:val="20"/>
-              </w:rPr>
-              <w:t xml:space="preserve"> = </w:t>
+              <w:t xml:space="preserve"> = chỉ đơn vị đã có Luồng tiếp nhận hồ sơ "Giải quyết yêu cầu bồi thường" (nhận được hồ sơ nộp qua DVC). Mặc định </w:t>
+            </w:r>
+            <w:r>
+              <w:rPr>
+                <w:rFonts w:ascii="Consolas" w:hAnsi="Consolas" w:eastAsia="Consolas"/>
+                <w:color w:val="A31515"/>
+                <w:sz w:val="20"/>
+              </w:rPr>
+              <w:t>false</w:t>
+            </w:r>
+            <w:r>
+              <w:rPr>
+                <w:sz w:val="20"/>
+              </w:rPr>
+              <w:t xml:space="preserve">; giá trị khác </w:t>
             </w:r>
             <w:r>
               <w:rPr>
@@ -6891,6 +6916,54 @@
                 <w:sz w:val="20"/>
               </w:rPr>
               <w:t>true</w:t>
+            </w:r>
+            <w:r>
+              <w:rPr>
+                <w:sz w:val="20"/>
+              </w:rPr>
+              <w:t>/</w:t>
+            </w:r>
+            <w:r>
+              <w:rPr>
+                <w:rFonts w:ascii="Consolas" w:hAnsi="Consolas" w:eastAsia="Consolas"/>
+                <w:color w:val="A31515"/>
+                <w:sz w:val="20"/>
+              </w:rPr>
+              <w:t>false</w:t>
+            </w:r>
+            <w:r>
+              <w:rPr>
+                <w:sz w:val="20"/>
+              </w:rPr>
+              <w:t xml:space="preserve"> trả 400 </w:t>
+            </w:r>
+            <w:r>
+              <w:rPr>
+                <w:rFonts w:ascii="Consolas" w:hAnsi="Consolas" w:eastAsia="Consolas"/>
+                <w:color w:val="A31515"/>
+                <w:sz w:val="20"/>
+              </w:rPr>
+              <w:t>VALIDATION_ERROR</w:t>
+            </w:r>
+            <w:r>
+              <w:rPr>
+                <w:sz w:val="20"/>
+              </w:rPr>
+              <w:t xml:space="preserve">. Khuyến nghị DVC luôn dùng </w:t>
+            </w:r>
+            <w:r>
+              <w:rPr>
+                <w:rFonts w:ascii="Consolas" w:hAnsi="Consolas" w:eastAsia="Consolas"/>
+                <w:color w:val="A31515"/>
+                <w:sz w:val="20"/>
+              </w:rPr>
+              <w:t>true</w:t>
+            </w:r>
+            <w:r>
+              <w:rPr>
+                <w:sz w:val="20"/>
+              </w:rPr>
+              <w:t xml:space="preserve"> để hồ sơ nộp vào được chuyển ngay sang màn Tiếp nhận</w:t>
             </w:r>
           </w:p>
         </w:tc>
@@ -6898,29 +6971,87 @@
       <w:tr>
         <w:tc>
           <w:tcPr>
-            <w:tcW w:w="3232" w:type="dxa"/>
-          </w:tcPr>
-          <w:p>
-            <w:r>
-              <w:rPr>
-                <w:sz w:val="20"/>
-              </w:rPr>
-              <w:t>Tỉnh/Thành phố</w:t>
-            </w:r>
-          </w:p>
-        </w:tc>
-        <w:tc>
-          <w:tcPr>
-            <w:tcW w:w="6456" w:type="dxa"/>
-          </w:tcPr>
-          <w:p>
-            <w:r>
-              <w:rPr>
-                <w:rFonts w:ascii="Consolas" w:hAnsi="Consolas" w:eastAsia="Consolas"/>
-                <w:color w:val="A31515"/>
-                <w:sz w:val="20"/>
-              </w:rPr>
-              <w:t>areas?level=PROVINCE</w:t>
+            <w:tcW w:w="2430" w:type="dxa"/>
+          </w:tcPr>
+          <w:p>
+            <w:r>
+              <w:rPr>
+                <w:rFonts w:ascii="Consolas" w:hAnsi="Consolas" w:eastAsia="Consolas"/>
+                <w:color w:val="A31515"/>
+                <w:sz w:val="20"/>
+              </w:rPr>
+              <w:t>unit_level</w:t>
+            </w:r>
+          </w:p>
+        </w:tc>
+        <w:tc>
+          <w:tcPr>
+            <w:tcW w:w="7258" w:type="dxa"/>
+          </w:tcPr>
+          <w:p>
+            <w:r>
+              <w:rPr>
+                <w:rFonts w:ascii="Consolas" w:hAnsi="Consolas" w:eastAsia="Consolas"/>
+                <w:color w:val="A31515"/>
+                <w:sz w:val="20"/>
+              </w:rPr>
+              <w:t>CENTRAL</w:t>
+            </w:r>
+            <w:r>
+              <w:rPr>
+                <w:sz w:val="20"/>
+              </w:rPr>
+              <w:t xml:space="preserve">, </w:t>
+            </w:r>
+            <w:r>
+              <w:rPr>
+                <w:rFonts w:ascii="Consolas" w:hAnsi="Consolas" w:eastAsia="Consolas"/>
+                <w:color w:val="A31515"/>
+                <w:sz w:val="20"/>
+              </w:rPr>
+              <w:t>PROVINCE</w:t>
+            </w:r>
+            <w:r>
+              <w:rPr>
+                <w:sz w:val="20"/>
+              </w:rPr>
+              <w:t xml:space="preserve">, </w:t>
+            </w:r>
+            <w:r>
+              <w:rPr>
+                <w:rFonts w:ascii="Consolas" w:hAnsi="Consolas" w:eastAsia="Consolas"/>
+                <w:color w:val="A31515"/>
+                <w:sz w:val="20"/>
+              </w:rPr>
+              <w:t>WARD</w:t>
+            </w:r>
+            <w:r>
+              <w:rPr>
+                <w:sz w:val="20"/>
+              </w:rPr>
+              <w:t xml:space="preserve">, </w:t>
+            </w:r>
+            <w:r>
+              <w:rPr>
+                <w:rFonts w:ascii="Consolas" w:hAnsi="Consolas" w:eastAsia="Consolas"/>
+                <w:color w:val="A31515"/>
+                <w:sz w:val="20"/>
+              </w:rPr>
+              <w:t>DEPARTMENT</w:t>
+            </w:r>
+            <w:r>
+              <w:rPr>
+                <w:sz w:val="20"/>
+              </w:rPr>
+              <w:t xml:space="preserve">, </w:t>
+            </w:r>
+            <w:r>
+              <w:rPr>
+                <w:rFonts w:ascii="Consolas" w:hAnsi="Consolas" w:eastAsia="Consolas"/>
+                <w:color w:val="A31515"/>
+                <w:sz w:val="20"/>
+              </w:rPr>
+              <w:t>DISTRICT</w:t>
             </w:r>
           </w:p>
         </w:tc>
@@ -6928,29 +7059,45 @@
       <w:tr>
         <w:tc>
           <w:tcPr>
-            <w:tcW w:w="3232" w:type="dxa"/>
-          </w:tcPr>
-          <w:p>
-            <w:r>
-              <w:rPr>
-                <w:sz w:val="20"/>
-              </w:rPr>
-              <w:t>Phường/Xã</w:t>
-            </w:r>
-          </w:p>
-        </w:tc>
-        <w:tc>
-          <w:tcPr>
-            <w:tcW w:w="6456" w:type="dxa"/>
-          </w:tcPr>
-          <w:p>
-            <w:r>
-              <w:rPr>
-                <w:rFonts w:ascii="Consolas" w:hAnsi="Consolas" w:eastAsia="Consolas"/>
-                <w:color w:val="A31515"/>
-                <w:sz w:val="20"/>
-              </w:rPr>
-              <w:t>areas?level=WARD&amp;province_code=&lt;tỉnh đã chọn&gt;</w:t>
+            <w:tcW w:w="2430" w:type="dxa"/>
+          </w:tcPr>
+          <w:p>
+            <w:r>
+              <w:rPr>
+                <w:rFonts w:ascii="Consolas" w:hAnsi="Consolas" w:eastAsia="Consolas"/>
+                <w:color w:val="A31515"/>
+                <w:sz w:val="20"/>
+              </w:rPr>
+              <w:t>unit_type</w:t>
+            </w:r>
+          </w:p>
+        </w:tc>
+        <w:tc>
+          <w:tcPr>
+            <w:tcW w:w="7258" w:type="dxa"/>
+          </w:tcPr>
+          <w:p>
+            <w:r>
+              <w:rPr>
+                <w:rFonts w:ascii="Consolas" w:hAnsi="Consolas" w:eastAsia="Consolas"/>
+                <w:color w:val="A31515"/>
+                <w:sz w:val="20"/>
+              </w:rPr>
+              <w:t>INTERNAL</w:t>
+            </w:r>
+            <w:r>
+              <w:rPr>
+                <w:sz w:val="20"/>
+              </w:rPr>
+              <w:t xml:space="preserve">, </w:t>
+            </w:r>
+            <w:r>
+              <w:rPr>
+                <w:rFonts w:ascii="Consolas" w:hAnsi="Consolas" w:eastAsia="Consolas"/>
+                <w:color w:val="A31515"/>
+                <w:sz w:val="20"/>
+              </w:rPr>
+              <w:t>EXTERNAL</w:t>
             </w:r>
           </w:p>
         </w:tc>
@@ -6958,29 +7105,280 @@
       <w:tr>
         <w:tc>
           <w:tcPr>
-            <w:tcW w:w="3232" w:type="dxa"/>
-          </w:tcPr>
-          <w:p>
-            <w:r>
-              <w:rPr>
-                <w:sz w:val="20"/>
-              </w:rPr>
-              <w:t>Cơ quan giải quyết bồi thường</w:t>
-            </w:r>
-          </w:p>
-        </w:tc>
-        <w:tc>
-          <w:tcPr>
-            <w:tcW w:w="6456" w:type="dxa"/>
-          </w:tcPr>
-          <w:p>
-            <w:r>
-              <w:rPr>
-                <w:rFonts w:ascii="Consolas" w:hAnsi="Consolas" w:eastAsia="Consolas"/>
-                <w:color w:val="A31515"/>
-                <w:sz w:val="20"/>
-              </w:rPr>
-              <w:t>org-units?province_code=&lt;Tỉnh/Thành phố cơ quan giải quyết&gt;</w:t>
+            <w:tcW w:w="2430" w:type="dxa"/>
+          </w:tcPr>
+          <w:p>
+            <w:r>
+              <w:rPr>
+                <w:rFonts w:ascii="Consolas" w:hAnsi="Consolas" w:eastAsia="Consolas"/>
+                <w:color w:val="A31515"/>
+                <w:sz w:val="20"/>
+              </w:rPr>
+              <w:t>org_type</w:t>
+            </w:r>
+          </w:p>
+        </w:tc>
+        <w:tc>
+          <w:tcPr>
+            <w:tcW w:w="7258" w:type="dxa"/>
+          </w:tcPr>
+          <w:p>
+            <w:r>
+              <w:rPr>
+                <w:sz w:val="20"/>
+              </w:rPr>
+              <w:t>Loại cơ quan (mã danh mục DM_57)</w:t>
+            </w:r>
+          </w:p>
+        </w:tc>
+      </w:tr>
+    </w:tbl>
+    <w:p>
+      <w:r>
+        <w:t xml:space="preserve">Không có </w:t>
+      </w:r>
+      <w:r>
+        <w:rPr>
+          <w:rFonts w:ascii="Consolas" w:hAnsi="Consolas" w:eastAsia="Consolas"/>
+          <w:color w:val="A31515"/>
+        </w:rPr>
+        <w:t>last_sync_time</w:t>
+      </w:r>
+      <w:r>
+        <w:t xml:space="preserve"> và không </w:t>
+      </w:r>
+      <w:r>
+        <w:rPr>
+          <w:rFonts w:ascii="Consolas" w:hAnsi="Consolas" w:eastAsia="Consolas"/>
+          <w:color w:val="A31515"/>
+        </w:rPr>
+        <w:t>include_inactive</w:t>
+      </w:r>
+      <w:r>
+        <w:t>: chỉ trả đơn vị đang hoạt động và còn hiệu lực (</w:t>
+      </w:r>
+      <w:r>
+        <w:rPr>
+          <w:rFonts w:ascii="Consolas" w:hAnsi="Consolas" w:eastAsia="Consolas"/>
+          <w:color w:val="A31515"/>
+        </w:rPr>
+        <w:t>effective_to</w:t>
+      </w:r>
+      <w:r>
+        <w:t xml:space="preserve"> trống hoặc chưa qua). Trường trả về: </w:t>
+      </w:r>
+      <w:r>
+        <w:rPr>
+          <w:rFonts w:ascii="Consolas" w:hAnsi="Consolas" w:eastAsia="Consolas"/>
+          <w:color w:val="A31515"/>
+        </w:rPr>
+        <w:t>id, code, name, short_name, parent_id, parent_code, depth, has_children, unit_type, unit_level, org_type, province_code, ward_code, address, phone, email, tax_code, sort_order, effective_from, effective_to, is_active, is_deleted, created_at, updated_at</w:t>
+      </w:r>
+      <w:r>
+        <w:t xml:space="preserve">; trong đó </w:t>
+      </w:r>
+      <w:r>
+        <w:rPr>
+          <w:rFonts w:ascii="Consolas" w:hAnsi="Consolas" w:eastAsia="Consolas"/>
+          <w:color w:val="A31515"/>
+        </w:rPr>
+        <w:t>province_code</w:t>
+      </w:r>
+      <w:r>
+        <w:t xml:space="preserve"> là tỉnh suy ra như trên.</w:t>
+      </w:r>
+    </w:p>
+    <w:p>
+      <w:pPr>
+        <w:pStyle w:val="Heading2"/>
+      </w:pPr>
+      <w:r>
+        <w:t>6.5. Đồng bộ tăng dần</w:t>
+      </w:r>
+    </w:p>
+    <w:p>
+      <w:pPr>
+        <w:pStyle w:val="ListNumber"/>
+        <w:numPr>
+          <w:ilvl w:val="0"/>
+          <w:numId w:val="11"/>
+        </w:numPr>
+      </w:pPr>
+      <w:r>
+        <w:t xml:space="preserve">Lần đầu: gọi không có </w:t>
+      </w:r>
+      <w:r>
+        <w:rPr>
+          <w:rFonts w:ascii="Consolas" w:hAnsi="Consolas" w:eastAsia="Consolas"/>
+          <w:color w:val="A31515"/>
+        </w:rPr>
+        <w:t>last_sync_time</w:t>
+      </w:r>
+      <w:r>
+        <w:t>, đi hết các trang (</w:t>
+      </w:r>
+      <w:r>
+        <w:rPr>
+          <w:rFonts w:ascii="Consolas" w:hAnsi="Consolas" w:eastAsia="Consolas"/>
+          <w:color w:val="A31515"/>
+        </w:rPr>
+        <w:t>has_more=false</w:t>
+      </w:r>
+      <w:r>
+        <w:t xml:space="preserve"> là hết). Giữ </w:t>
+      </w:r>
+      <w:r>
+        <w:rPr>
+          <w:rFonts w:ascii="Consolas" w:hAnsi="Consolas" w:eastAsia="Consolas"/>
+          <w:color w:val="A31515"/>
+        </w:rPr>
+        <w:t>server_time</w:t>
+      </w:r>
+      <w:r>
+        <w:t xml:space="preserve"> của </w:t>
+      </w:r>
+      <w:r>
+        <w:rPr>
+          <w:b/>
+        </w:rPr>
+        <w:t>trang đầu tiên</w:t>
+      </w:r>
+      <w:r>
+        <w:t>.</w:t>
+      </w:r>
+    </w:p>
+    <w:p>
+      <w:pPr>
+        <w:pStyle w:val="ListNumber"/>
+        <w:numPr>
+          <w:ilvl w:val="0"/>
+          <w:numId w:val="11"/>
+        </w:numPr>
+      </w:pPr>
+      <w:r>
+        <w:t xml:space="preserve">Các lần sau: gọi với </w:t>
+      </w:r>
+      <w:r>
+        <w:rPr>
+          <w:rFonts w:ascii="Consolas" w:hAnsi="Consolas" w:eastAsia="Consolas"/>
+          <w:color w:val="A31515"/>
+        </w:rPr>
+        <w:t>last_sync_time</w:t>
+      </w:r>
+      <w:r>
+        <w:t xml:space="preserve"> = </w:t>
+      </w:r>
+      <w:r>
+        <w:rPr>
+          <w:rFonts w:ascii="Consolas" w:hAnsi="Consolas" w:eastAsia="Consolas"/>
+          <w:color w:val="A31515"/>
+        </w:rPr>
+        <w:t>server_time</w:t>
+      </w:r>
+      <w:r>
+        <w:t xml:space="preserve"> đã giữ (nên lùi vài phút, vd 5 phút), đi hết các trang, </w:t>
+      </w:r>
+      <w:r>
+        <w:rPr>
+          <w:b/>
+        </w:rPr>
+        <w:t xml:space="preserve">cập nhật/thêm theo </w:t>
+      </w:r>
+      <w:r>
+        <w:rPr>
+          <w:rFonts w:ascii="Consolas" w:hAnsi="Consolas" w:eastAsia="Consolas"/>
+          <w:b/>
+          <w:color w:val="A31515"/>
+        </w:rPr>
+        <w:t>id</w:t>
+      </w:r>
+      <w:r>
+        <w:t xml:space="preserve">; bản ghi </w:t>
+      </w:r>
+      <w:r>
+        <w:rPr>
+          <w:rFonts w:ascii="Consolas" w:hAnsi="Consolas" w:eastAsia="Consolas"/>
+          <w:color w:val="A31515"/>
+        </w:rPr>
+        <w:t>is_deleted=true</w:t>
+      </w:r>
+      <w:r>
+        <w:t xml:space="preserve"> thì xóa, </w:t>
+      </w:r>
+      <w:r>
+        <w:rPr>
+          <w:rFonts w:ascii="Consolas" w:hAnsi="Consolas" w:eastAsia="Consolas"/>
+          <w:color w:val="A31515"/>
+        </w:rPr>
+        <w:t>is_active=false</w:t>
+      </w:r>
+      <w:r>
+        <w:t xml:space="preserve"> thì ẩn khỏi E-Form.</w:t>
+      </w:r>
+    </w:p>
+    <w:p>
+      <w:pPr>
+        <w:pStyle w:val="ListNumber"/>
+        <w:numPr>
+          <w:ilvl w:val="0"/>
+          <w:numId w:val="11"/>
+        </w:numPr>
+      </w:pPr>
+      <w:r>
+        <w:t>Chỉ cập nhật mốc sau khi đi hết các trang thành công.</w:t>
+      </w:r>
+    </w:p>
+    <w:p>
+      <w:pPr>
+        <w:pStyle w:val="Heading2"/>
+      </w:pPr>
+      <w:r>
+        <w:t>6.6. Quy tắc dùng danh mục trên E-Form</w:t>
+      </w:r>
+    </w:p>
+    <w:tbl>
+      <w:tblPr>
+        <w:tblStyle w:val="TableGrid"/>
+        <w:tblW w:w="9688" w:type="dxa"/>
+        <w:jc w:val="center"/>
+        <w:tblLayout w:type="fixed"/>
+        <w:tblLook w:firstColumn="1" w:firstRow="1" w:lastColumn="0" w:lastRow="0" w:noHBand="0" w:noVBand="1" w:val="04A0"/>
+      </w:tblPr>
+      <w:tblGrid>
+        <w:gridCol w:w="3201"/>
+        <w:gridCol w:w="6487"/>
+      </w:tblGrid>
+      <w:tr>
+        <w:trPr>
+          <w:tblHeader/>
+        </w:trPr>
+        <w:tc>
+          <w:tcPr>
+            <w:tcW w:w="3201" w:type="dxa"/>
+            <w:shd w:val="clear" w:color="auto" w:fill="DCE6F2"/>
+          </w:tcPr>
+          <w:p>
+            <w:r>
+              <w:rPr>
+                <w:b/>
+                <w:sz w:val="20"/>
+              </w:rPr>
+              <w:t>Ô E-Form</w:t>
+            </w:r>
+          </w:p>
+        </w:tc>
+        <w:tc>
+          <w:tcPr>
+            <w:tcW w:w="6487" w:type="dxa"/>
+            <w:shd w:val="clear" w:color="auto" w:fill="DCE6F2"/>
+          </w:tcPr>
+          <w:p>
+            <w:r>
+              <w:rPr>
+                <w:b/>
+                <w:sz w:val="20"/>
+              </w:rPr>
+              <w:t>Quy tắc</w:t>
             </w:r>
           </w:p>
         </w:tc>
@@ -6988,35 +7386,55 @@
       <w:tr>
         <w:tc>
           <w:tcPr>
-            <w:tcW w:w="3232" w:type="dxa"/>
-          </w:tcPr>
-          <w:p>
-            <w:r>
-              <w:rPr>
-                <w:sz w:val="20"/>
-              </w:rPr>
-              <w:t>Hình thức tiếp nhận</w:t>
-            </w:r>
-          </w:p>
-        </w:tc>
-        <w:tc>
-          <w:tcPr>
-            <w:tcW w:w="6456" w:type="dxa"/>
-          </w:tcPr>
-          <w:p>
-            <w:r>
-              <w:rPr>
-                <w:sz w:val="20"/>
-              </w:rPr>
-              <w:t xml:space="preserve">Cố định </w:t>
-            </w:r>
-            <w:r>
-              <w:rPr>
-                <w:rFonts w:ascii="Consolas" w:hAnsi="Consolas" w:eastAsia="Consolas"/>
-                <w:color w:val="A31515"/>
-                <w:sz w:val="20"/>
-              </w:rPr>
-              <w:t>DICH_VU_CONG</w:t>
+            <w:tcW w:w="3201" w:type="dxa"/>
+          </w:tcPr>
+          <w:p>
+            <w:r>
+              <w:rPr>
+                <w:sz w:val="20"/>
+              </w:rPr>
+              <w:t>Loại giấy tờ thân nhân</w:t>
+            </w:r>
+          </w:p>
+        </w:tc>
+        <w:tc>
+          <w:tcPr>
+            <w:tcW w:w="6487" w:type="dxa"/>
+          </w:tcPr>
+          <w:p>
+            <w:r>
+              <w:rPr>
+                <w:sz w:val="20"/>
+              </w:rPr>
+              <w:t xml:space="preserve">Chỉ hiện giá trị DM_10 có </w:t>
+            </w:r>
+            <w:r>
+              <w:rPr>
+                <w:rFonts w:ascii="Consolas" w:hAnsi="Consolas" w:eastAsia="Consolas"/>
+                <w:color w:val="A31515"/>
+                <w:sz w:val="20"/>
+              </w:rPr>
+              <w:t>use_on_eform</w:t>
+            </w:r>
+            <w:r>
+              <w:rPr>
+                <w:sz w:val="20"/>
+              </w:rPr>
+              <w:t xml:space="preserve"> = </w:t>
+            </w:r>
+            <w:r>
+              <w:rPr>
+                <w:rFonts w:ascii="Consolas" w:hAnsi="Consolas" w:eastAsia="Consolas"/>
+                <w:color w:val="A31515"/>
+                <w:sz w:val="20"/>
+              </w:rPr>
+              <w:t>true</w:t>
+            </w:r>
+            <w:r>
+              <w:rPr>
+                <w:sz w:val="20"/>
+              </w:rPr>
+              <w:t xml:space="preserve"> (không có Mã số thuế)</w:t>
             </w:r>
           </w:p>
         </w:tc>
@@ -7024,83 +7442,85 @@
       <w:tr>
         <w:tc>
           <w:tcPr>
-            <w:tcW w:w="3232" w:type="dxa"/>
-          </w:tcPr>
-          <w:p>
-            <w:r>
-              <w:rPr>
-                <w:sz w:val="20"/>
-              </w:rPr>
-              <w:t>Bảng thiệt hại yêu cầu bồi thường</w:t>
-            </w:r>
-          </w:p>
-        </w:tc>
-        <w:tc>
-          <w:tcPr>
-            <w:tcW w:w="6456" w:type="dxa"/>
-          </w:tcPr>
-          <w:p>
-            <w:r>
-              <w:rPr>
-                <w:sz w:val="20"/>
-              </w:rPr>
-              <w:t xml:space="preserve">Dựng bảng 02 cấp từ </w:t>
-            </w:r>
-            <w:r>
-              <w:rPr>
-                <w:rFonts w:ascii="Consolas" w:hAnsi="Consolas" w:eastAsia="Consolas"/>
-                <w:color w:val="A31515"/>
-                <w:sz w:val="20"/>
-              </w:rPr>
-              <w:t>DM_27</w:t>
-            </w:r>
-            <w:r>
-              <w:rPr>
-                <w:sz w:val="20"/>
-              </w:rPr>
-              <w:t xml:space="preserve"> theo </w:t>
-            </w:r>
-            <w:r>
-              <w:rPr>
-                <w:rFonts w:ascii="Consolas" w:hAnsi="Consolas" w:eastAsia="Consolas"/>
-                <w:color w:val="A31515"/>
-                <w:sz w:val="20"/>
-              </w:rPr>
-              <w:t>parent_code</w:t>
-            </w:r>
-            <w:r>
-              <w:rPr>
-                <w:sz w:val="20"/>
-              </w:rPr>
-              <w:t xml:space="preserve">, thứ tự </w:t>
-            </w:r>
-            <w:r>
-              <w:rPr>
-                <w:rFonts w:ascii="Consolas" w:hAnsi="Consolas" w:eastAsia="Consolas"/>
-                <w:color w:val="A31515"/>
-                <w:sz w:val="20"/>
-              </w:rPr>
-              <w:t>sort_order</w:t>
-            </w:r>
-            <w:r>
-              <w:rPr>
-                <w:sz w:val="20"/>
-              </w:rPr>
-              <w:t xml:space="preserve">; nhóm </w:t>
-            </w:r>
-            <w:r>
-              <w:rPr>
-                <w:rFonts w:ascii="Consolas" w:hAnsi="Consolas" w:eastAsia="Consolas"/>
-                <w:color w:val="A31515"/>
-                <w:sz w:val="20"/>
-              </w:rPr>
-              <w:t>TH_KHAC</w:t>
-            </w:r>
-            <w:r>
-              <w:rPr>
-                <w:sz w:val="20"/>
-              </w:rPr>
-              <w:t xml:space="preserve"> ở cuối, người nộp tự thêm dòng</w:t>
+            <w:tcW w:w="3201" w:type="dxa"/>
+          </w:tcPr>
+          <w:p>
+            <w:r>
+              <w:rPr>
+                <w:sz w:val="20"/>
+              </w:rPr>
+              <w:t>Tư cách người yêu cầu</w:t>
+            </w:r>
+          </w:p>
+        </w:tc>
+        <w:tc>
+          <w:tcPr>
+            <w:tcW w:w="6487" w:type="dxa"/>
+          </w:tcPr>
+          <w:p>
+            <w:r>
+              <w:rPr>
+                <w:rFonts w:ascii="Consolas" w:hAnsi="Consolas" w:eastAsia="Consolas"/>
+                <w:color w:val="A31515"/>
+                <w:sz w:val="20"/>
+              </w:rPr>
+              <w:t>Loại người yêu cầu</w:t>
+            </w:r>
+            <w:r>
+              <w:rPr>
+                <w:sz w:val="20"/>
+              </w:rPr>
+              <w:t xml:space="preserve"> = Cá nhân: giá trị DM_26 có </w:t>
+            </w:r>
+            <w:r>
+              <w:rPr>
+                <w:rFonts w:ascii="Consolas" w:hAnsi="Consolas" w:eastAsia="Consolas"/>
+                <w:color w:val="A31515"/>
+                <w:sz w:val="20"/>
+              </w:rPr>
+              <w:t>for_individual</w:t>
+            </w:r>
+            <w:r>
+              <w:rPr>
+                <w:sz w:val="20"/>
+              </w:rPr>
+              <w:t xml:space="preserve"> = </w:t>
+            </w:r>
+            <w:r>
+              <w:rPr>
+                <w:rFonts w:ascii="Consolas" w:hAnsi="Consolas" w:eastAsia="Consolas"/>
+                <w:color w:val="A31515"/>
+                <w:sz w:val="20"/>
+              </w:rPr>
+              <w:t>true</w:t>
+            </w:r>
+            <w:r>
+              <w:rPr>
+                <w:sz w:val="20"/>
+              </w:rPr>
+              <w:t xml:space="preserve">; = Tổ chức: có </w:t>
+            </w:r>
+            <w:r>
+              <w:rPr>
+                <w:rFonts w:ascii="Consolas" w:hAnsi="Consolas" w:eastAsia="Consolas"/>
+                <w:color w:val="A31515"/>
+                <w:sz w:val="20"/>
+              </w:rPr>
+              <w:t>for_organization</w:t>
+            </w:r>
+            <w:r>
+              <w:rPr>
+                <w:sz w:val="20"/>
+              </w:rPr>
+              <w:t xml:space="preserve"> = </w:t>
+            </w:r>
+            <w:r>
+              <w:rPr>
+                <w:rFonts w:ascii="Consolas" w:hAnsi="Consolas" w:eastAsia="Consolas"/>
+                <w:color w:val="A31515"/>
+                <w:sz w:val="20"/>
+              </w:rPr>
+              <w:t>true</w:t>
             </w:r>
           </w:p>
         </w:tc>
@@ -7108,7 +7528,223 @@
       <w:tr>
         <w:tc>
           <w:tcPr>
-            <w:tcW w:w="3232" w:type="dxa"/>
+            <w:tcW w:w="3201" w:type="dxa"/>
+          </w:tcPr>
+          <w:p>
+            <w:r>
+              <w:rPr>
+                <w:sz w:val="20"/>
+              </w:rPr>
+              <w:t>Tỉnh/Thành phố</w:t>
+            </w:r>
+          </w:p>
+        </w:tc>
+        <w:tc>
+          <w:tcPr>
+            <w:tcW w:w="6487" w:type="dxa"/>
+          </w:tcPr>
+          <w:p>
+            <w:r>
+              <w:rPr>
+                <w:rFonts w:ascii="Consolas" w:hAnsi="Consolas" w:eastAsia="Consolas"/>
+                <w:color w:val="A31515"/>
+                <w:sz w:val="20"/>
+              </w:rPr>
+              <w:t>areas?level=PROVINCE</w:t>
+            </w:r>
+          </w:p>
+        </w:tc>
+      </w:tr>
+      <w:tr>
+        <w:tc>
+          <w:tcPr>
+            <w:tcW w:w="3201" w:type="dxa"/>
+          </w:tcPr>
+          <w:p>
+            <w:r>
+              <w:rPr>
+                <w:sz w:val="20"/>
+              </w:rPr>
+              <w:t>Phường/Xã</w:t>
+            </w:r>
+          </w:p>
+        </w:tc>
+        <w:tc>
+          <w:tcPr>
+            <w:tcW w:w="6487" w:type="dxa"/>
+          </w:tcPr>
+          <w:p>
+            <w:r>
+              <w:rPr>
+                <w:rFonts w:ascii="Consolas" w:hAnsi="Consolas" w:eastAsia="Consolas"/>
+                <w:color w:val="A31515"/>
+                <w:sz w:val="20"/>
+              </w:rPr>
+              <w:t>areas?level=WARD&amp;province_code=&lt;tỉnh đã chọn&gt;</w:t>
+            </w:r>
+          </w:p>
+        </w:tc>
+      </w:tr>
+      <w:tr>
+        <w:tc>
+          <w:tcPr>
+            <w:tcW w:w="3201" w:type="dxa"/>
+          </w:tcPr>
+          <w:p>
+            <w:r>
+              <w:rPr>
+                <w:sz w:val="20"/>
+              </w:rPr>
+              <w:t>Cơ quan giải quyết bồi thường</w:t>
+            </w:r>
+          </w:p>
+        </w:tc>
+        <w:tc>
+          <w:tcPr>
+            <w:tcW w:w="6487" w:type="dxa"/>
+          </w:tcPr>
+          <w:p>
+            <w:r>
+              <w:rPr>
+                <w:rFonts w:ascii="Consolas" w:hAnsi="Consolas" w:eastAsia="Consolas"/>
+                <w:color w:val="A31515"/>
+                <w:sz w:val="20"/>
+              </w:rPr>
+              <w:t>org-units?province_code=&lt;Tỉnh/Thành phố cơ quan giải quyết&gt;&amp;claim_intake_only=true</w:t>
+            </w:r>
+            <w:r>
+              <w:rPr>
+                <w:sz w:val="20"/>
+              </w:rPr>
+              <w:t xml:space="preserve"> (chỉ cơ quan đã có Luồng tiếp nhận; tỉnh suy ra theo cây, mục 6.4)</w:t>
+            </w:r>
+          </w:p>
+        </w:tc>
+      </w:tr>
+      <w:tr>
+        <w:tc>
+          <w:tcPr>
+            <w:tcW w:w="3201" w:type="dxa"/>
+          </w:tcPr>
+          <w:p>
+            <w:r>
+              <w:rPr>
+                <w:sz w:val="20"/>
+              </w:rPr>
+              <w:t>Hình thức tiếp nhận</w:t>
+            </w:r>
+          </w:p>
+        </w:tc>
+        <w:tc>
+          <w:tcPr>
+            <w:tcW w:w="6487" w:type="dxa"/>
+          </w:tcPr>
+          <w:p>
+            <w:r>
+              <w:rPr>
+                <w:sz w:val="20"/>
+              </w:rPr>
+              <w:t xml:space="preserve">Cố định </w:t>
+            </w:r>
+            <w:r>
+              <w:rPr>
+                <w:rFonts w:ascii="Consolas" w:hAnsi="Consolas" w:eastAsia="Consolas"/>
+                <w:color w:val="A31515"/>
+                <w:sz w:val="20"/>
+              </w:rPr>
+              <w:t>DICH_VU_CONG</w:t>
+            </w:r>
+          </w:p>
+        </w:tc>
+      </w:tr>
+      <w:tr>
+        <w:tc>
+          <w:tcPr>
+            <w:tcW w:w="3201" w:type="dxa"/>
+          </w:tcPr>
+          <w:p>
+            <w:r>
+              <w:rPr>
+                <w:sz w:val="20"/>
+              </w:rPr>
+              <w:t>Bảng thiệt hại yêu cầu bồi thường</w:t>
+            </w:r>
+          </w:p>
+        </w:tc>
+        <w:tc>
+          <w:tcPr>
+            <w:tcW w:w="6487" w:type="dxa"/>
+          </w:tcPr>
+          <w:p>
+            <w:r>
+              <w:rPr>
+                <w:sz w:val="20"/>
+              </w:rPr>
+              <w:t xml:space="preserve">Dựng bảng 02 cấp từ </w:t>
+            </w:r>
+            <w:r>
+              <w:rPr>
+                <w:rFonts w:ascii="Consolas" w:hAnsi="Consolas" w:eastAsia="Consolas"/>
+                <w:color w:val="A31515"/>
+                <w:sz w:val="20"/>
+              </w:rPr>
+              <w:t>DM_27</w:t>
+            </w:r>
+            <w:r>
+              <w:rPr>
+                <w:sz w:val="20"/>
+              </w:rPr>
+              <w:t xml:space="preserve"> theo </w:t>
+            </w:r>
+            <w:r>
+              <w:rPr>
+                <w:rFonts w:ascii="Consolas" w:hAnsi="Consolas" w:eastAsia="Consolas"/>
+                <w:color w:val="A31515"/>
+                <w:sz w:val="20"/>
+              </w:rPr>
+              <w:t>parent_code</w:t>
+            </w:r>
+            <w:r>
+              <w:rPr>
+                <w:sz w:val="20"/>
+              </w:rPr>
+              <w:t xml:space="preserve">, thứ tự </w:t>
+            </w:r>
+            <w:r>
+              <w:rPr>
+                <w:rFonts w:ascii="Consolas" w:hAnsi="Consolas" w:eastAsia="Consolas"/>
+                <w:color w:val="A31515"/>
+                <w:sz w:val="20"/>
+              </w:rPr>
+              <w:t>sort_order</w:t>
+            </w:r>
+            <w:r>
+              <w:rPr>
+                <w:sz w:val="20"/>
+              </w:rPr>
+              <w:t xml:space="preserve">; nhóm </w:t>
+            </w:r>
+            <w:r>
+              <w:rPr>
+                <w:rFonts w:ascii="Consolas" w:hAnsi="Consolas" w:eastAsia="Consolas"/>
+                <w:color w:val="A31515"/>
+                <w:sz w:val="20"/>
+              </w:rPr>
+              <w:t>TH_KHAC</w:t>
+            </w:r>
+            <w:r>
+              <w:rPr>
+                <w:sz w:val="20"/>
+              </w:rPr>
+              <w:t xml:space="preserve"> ở cuối, người nộp tự thêm dòng</w:t>
+            </w:r>
+          </w:p>
+        </w:tc>
+      </w:tr>
+      <w:tr>
+        <w:tc>
+          <w:tcPr>
+            <w:tcW w:w="3201" w:type="dxa"/>
           </w:tcPr>
           <w:p>
             <w:r>
@@ -7121,7 +7757,7 @@
         </w:tc>
         <w:tc>
           <w:tcPr>
-            <w:tcW w:w="6456" w:type="dxa"/>
+            <w:tcW w:w="6487" w:type="dxa"/>
           </w:tcPr>
           <w:p>
             <w:r>
@@ -7403,7 +8039,17 @@
         <w:t>REJECTED</w:t>
       </w:r>
       <w:r>
-        <w:t>, kèm lý do).</w:t>
+        <w:t>, kèm lý do). Sau khi vào hệ thống, cùng API này trả thêm tiến độ giải quyết (</w:t>
+      </w:r>
+      <w:r>
+        <w:rPr>
+          <w:rFonts w:ascii="Consolas" w:hAnsi="Consolas" w:eastAsia="Consolas"/>
+          <w:color w:val="A31515"/>
+        </w:rPr>
+        <w:t>progress</w:t>
+      </w:r>
+      <w:r>
+        <w:t>: trạng thái hồ sơ và các văn bản đã ban hành).</w:t>
       </w:r>
     </w:p>
     <w:p>
@@ -17340,7 +17986,7 @@
               <w:rPr>
                 <w:sz w:val="20"/>
               </w:rPr>
-              <w:t>), thuộc Tỉnh/Thành phố cơ quan giải quyết</w:t>
+              <w:t>), thuộc Tỉnh/Thành phố cơ quan giải quyết (tỉnh suy ra theo cây đơn vị như mục 6.4)</w:t>
             </w:r>
           </w:p>
         </w:tc>
@@ -18209,7 +18855,21 @@
           <w:rFonts w:ascii="Consolas" w:hAnsi="Consolas" w:eastAsia="Consolas"/>
           <w:sz w:val="17"/>
         </w:rPr>
-        <w:t xml:space="preserve">    "duplicate": false</w:t>
+        <w:t xml:space="preserve">    "duplicate": false,</w:t>
+      </w:r>
+    </w:p>
+    <w:p>
+      <w:pPr>
+        <w:shd w:val="clear" w:color="auto" w:fill="F2F4F7"/>
+        <w:spacing w:after="0" w:before="0"/>
+        <w:ind w:left="170"/>
+      </w:pPr>
+      <w:r>
+        <w:rPr>
+          <w:rFonts w:ascii="Consolas" w:hAnsi="Consolas" w:eastAsia="Consolas"/>
+          <w:sz w:val="17"/>
+        </w:rPr>
+        <w:t xml:space="preserve">    "progress": null</w:t>
       </w:r>
     </w:p>
     <w:p>
@@ -18919,6 +19579,1137 @@
       </w:r>
       <w:r>
         <w:t xml:space="preserve"> = "Bị từ chối".</w:t>
+      </w:r>
+    </w:p>
+    <w:p>
+      <w:r>
+        <w:rPr>
+          <w:b/>
+        </w:rPr>
+        <w:t>Tiến độ xử lý (</w:t>
+      </w:r>
+      <w:r>
+        <w:rPr>
+          <w:rFonts w:ascii="Consolas" w:hAnsi="Consolas" w:eastAsia="Consolas"/>
+          <w:b/>
+          <w:color w:val="A31515"/>
+        </w:rPr>
+        <w:t>data.progress</w:t>
+      </w:r>
+      <w:r>
+        <w:rPr>
+          <w:b/>
+        </w:rPr>
+        <w:t>).</w:t>
+      </w:r>
+      <w:r>
+        <w:t xml:space="preserve"> Hồ sơ </w:t>
+      </w:r>
+      <w:r>
+        <w:rPr>
+          <w:rFonts w:ascii="Consolas" w:hAnsi="Consolas" w:eastAsia="Consolas"/>
+          <w:color w:val="A31515"/>
+        </w:rPr>
+        <w:t>ACCEPTED</w:t>
+      </w:r>
+      <w:r>
+        <w:t xml:space="preserve"> có thêm khối </w:t>
+      </w:r>
+      <w:r>
+        <w:rPr>
+          <w:rFonts w:ascii="Consolas" w:hAnsi="Consolas" w:eastAsia="Consolas"/>
+          <w:color w:val="A31515"/>
+        </w:rPr>
+        <w:t>progress</w:t>
+      </w:r>
+      <w:r>
+        <w:t xml:space="preserve">; hồ sơ </w:t>
+      </w:r>
+      <w:r>
+        <w:rPr>
+          <w:rFonts w:ascii="Consolas" w:hAnsi="Consolas" w:eastAsia="Consolas"/>
+          <w:color w:val="A31515"/>
+        </w:rPr>
+        <w:t>RECEIVED</w:t>
+      </w:r>
+      <w:r>
+        <w:t xml:space="preserve">, </w:t>
+      </w:r>
+      <w:r>
+        <w:rPr>
+          <w:rFonts w:ascii="Consolas" w:hAnsi="Consolas" w:eastAsia="Consolas"/>
+          <w:color w:val="A31515"/>
+        </w:rPr>
+        <w:t>REJECTED</w:t>
+      </w:r>
+      <w:r>
+        <w:t xml:space="preserve"> và phản hồi của lượt gửi hồ sơ (mục 7.7) có </w:t>
+      </w:r>
+      <w:r>
+        <w:rPr>
+          <w:rFonts w:ascii="Consolas" w:hAnsi="Consolas" w:eastAsia="Consolas"/>
+          <w:color w:val="A31515"/>
+        </w:rPr>
+        <w:t>progress</w:t>
+      </w:r>
+      <w:r>
+        <w:t xml:space="preserve"> = </w:t>
+      </w:r>
+      <w:r>
+        <w:rPr>
+          <w:rFonts w:ascii="Consolas" w:hAnsi="Consolas" w:eastAsia="Consolas"/>
+          <w:color w:val="A31515"/>
+        </w:rPr>
+        <w:t>null</w:t>
+      </w:r>
+      <w:r>
+        <w:t>. Các trường khác không đổi.</w:t>
+      </w:r>
+    </w:p>
+    <w:tbl>
+      <w:tblPr>
+        <w:tblStyle w:val="TableGrid"/>
+        <w:tblW w:w="9688" w:type="dxa"/>
+        <w:jc w:val="center"/>
+        <w:tblLayout w:type="fixed"/>
+        <w:tblLook w:firstColumn="1" w:firstRow="1" w:lastColumn="0" w:lastRow="0" w:noHBand="0" w:noVBand="1" w:val="04A0"/>
+      </w:tblPr>
+      <w:tblGrid>
+        <w:gridCol w:w="2922"/>
+        <w:gridCol w:w="2065"/>
+        <w:gridCol w:w="4701"/>
+      </w:tblGrid>
+      <w:tr>
+        <w:trPr>
+          <w:tblHeader/>
+        </w:trPr>
+        <w:tc>
+          <w:tcPr>
+            <w:tcW w:w="2922" w:type="dxa"/>
+            <w:shd w:val="clear" w:color="auto" w:fill="DCE6F2"/>
+          </w:tcPr>
+          <w:p>
+            <w:r>
+              <w:rPr>
+                <w:b/>
+                <w:sz w:val="20"/>
+              </w:rPr>
+              <w:t>Trường</w:t>
+            </w:r>
+          </w:p>
+        </w:tc>
+        <w:tc>
+          <w:tcPr>
+            <w:tcW w:w="2065" w:type="dxa"/>
+            <w:shd w:val="clear" w:color="auto" w:fill="DCE6F2"/>
+          </w:tcPr>
+          <w:p>
+            <w:r>
+              <w:rPr>
+                <w:b/>
+                <w:sz w:val="20"/>
+              </w:rPr>
+              <w:t>Kiểu</w:t>
+            </w:r>
+          </w:p>
+        </w:tc>
+        <w:tc>
+          <w:tcPr>
+            <w:tcW w:w="4701" w:type="dxa"/>
+            <w:shd w:val="clear" w:color="auto" w:fill="DCE6F2"/>
+          </w:tcPr>
+          <w:p>
+            <w:r>
+              <w:rPr>
+                <w:b/>
+                <w:sz w:val="20"/>
+              </w:rPr>
+              <w:t>Ý nghĩa</w:t>
+            </w:r>
+          </w:p>
+        </w:tc>
+      </w:tr>
+      <w:tr>
+        <w:tc>
+          <w:tcPr>
+            <w:tcW w:w="2922" w:type="dxa"/>
+          </w:tcPr>
+          <w:p>
+            <w:r>
+              <w:rPr>
+                <w:rFonts w:ascii="Consolas" w:hAnsi="Consolas" w:eastAsia="Consolas"/>
+                <w:color w:val="A31515"/>
+                <w:sz w:val="20"/>
+              </w:rPr>
+              <w:t>progress.claim_status</w:t>
+            </w:r>
+          </w:p>
+        </w:tc>
+        <w:tc>
+          <w:tcPr>
+            <w:tcW w:w="2065" w:type="dxa"/>
+          </w:tcPr>
+          <w:p>
+            <w:r>
+              <w:rPr>
+                <w:sz w:val="20"/>
+              </w:rPr>
+              <w:t>Chuỗi</w:t>
+            </w:r>
+          </w:p>
+        </w:tc>
+        <w:tc>
+          <w:tcPr>
+            <w:tcW w:w="4701" w:type="dxa"/>
+          </w:tcPr>
+          <w:p>
+            <w:r>
+              <w:rPr>
+                <w:sz w:val="20"/>
+              </w:rPr>
+              <w:t xml:space="preserve">Mã trạng thái hiện tại của hồ sơ theo danh mục DM_24 (vd </w:t>
+            </w:r>
+            <w:r>
+              <w:rPr>
+                <w:rFonts w:ascii="Consolas" w:hAnsi="Consolas" w:eastAsia="Consolas"/>
+                <w:color w:val="A31515"/>
+                <w:sz w:val="20"/>
+              </w:rPr>
+              <w:t>CHO_PHAN_CONG</w:t>
+            </w:r>
+            <w:r>
+              <w:rPr>
+                <w:sz w:val="20"/>
+              </w:rPr>
+              <w:t xml:space="preserve">, </w:t>
+            </w:r>
+            <w:r>
+              <w:rPr>
+                <w:rFonts w:ascii="Consolas" w:hAnsi="Consolas" w:eastAsia="Consolas"/>
+                <w:color w:val="A31515"/>
+                <w:sz w:val="20"/>
+              </w:rPr>
+              <w:t>DANG_XAC_MINH</w:t>
+            </w:r>
+            <w:r>
+              <w:rPr>
+                <w:sz w:val="20"/>
+              </w:rPr>
+              <w:t xml:space="preserve">, </w:t>
+            </w:r>
+            <w:r>
+              <w:rPr>
+                <w:rFonts w:ascii="Consolas" w:hAnsi="Consolas" w:eastAsia="Consolas"/>
+                <w:color w:val="A31515"/>
+                <w:sz w:val="20"/>
+              </w:rPr>
+              <w:t>YEU_CAU_BO_SUNG</w:t>
+            </w:r>
+            <w:r>
+              <w:rPr>
+                <w:sz w:val="20"/>
+              </w:rPr>
+              <w:t xml:space="preserve">, </w:t>
+            </w:r>
+            <w:r>
+              <w:rPr>
+                <w:rFonts w:ascii="Consolas" w:hAnsi="Consolas" w:eastAsia="Consolas"/>
+                <w:color w:val="A31515"/>
+                <w:sz w:val="20"/>
+              </w:rPr>
+              <w:t>HOAN_THANH</w:t>
+            </w:r>
+            <w:r>
+              <w:rPr>
+                <w:sz w:val="20"/>
+              </w:rPr>
+              <w:t>)</w:t>
+            </w:r>
+          </w:p>
+        </w:tc>
+      </w:tr>
+      <w:tr>
+        <w:tc>
+          <w:tcPr>
+            <w:tcW w:w="2922" w:type="dxa"/>
+          </w:tcPr>
+          <w:p>
+            <w:r>
+              <w:rPr>
+                <w:rFonts w:ascii="Consolas" w:hAnsi="Consolas" w:eastAsia="Consolas"/>
+                <w:color w:val="A31515"/>
+                <w:sz w:val="20"/>
+              </w:rPr>
+              <w:t>progress.claim_status_name</w:t>
+            </w:r>
+          </w:p>
+        </w:tc>
+        <w:tc>
+          <w:tcPr>
+            <w:tcW w:w="2065" w:type="dxa"/>
+          </w:tcPr>
+          <w:p>
+            <w:r>
+              <w:rPr>
+                <w:sz w:val="20"/>
+              </w:rPr>
+              <w:t>Chuỗi</w:t>
+            </w:r>
+          </w:p>
+        </w:tc>
+        <w:tc>
+          <w:tcPr>
+            <w:tcW w:w="4701" w:type="dxa"/>
+          </w:tcPr>
+          <w:p>
+            <w:r>
+              <w:rPr>
+                <w:sz w:val="20"/>
+              </w:rPr>
+              <w:t>Tên trạng thái theo DM_24 (</w:t>
+            </w:r>
+            <w:r>
+              <w:rPr>
+                <w:rFonts w:ascii="Consolas" w:hAnsi="Consolas" w:eastAsia="Consolas"/>
+                <w:color w:val="A31515"/>
+                <w:sz w:val="20"/>
+              </w:rPr>
+              <w:t>null</w:t>
+            </w:r>
+            <w:r>
+              <w:rPr>
+                <w:sz w:val="20"/>
+              </w:rPr>
+              <w:t xml:space="preserve"> nếu mã không còn trong danh mục)</w:t>
+            </w:r>
+          </w:p>
+        </w:tc>
+      </w:tr>
+      <w:tr>
+        <w:tc>
+          <w:tcPr>
+            <w:tcW w:w="2922" w:type="dxa"/>
+          </w:tcPr>
+          <w:p>
+            <w:r>
+              <w:rPr>
+                <w:rFonts w:ascii="Consolas" w:hAnsi="Consolas" w:eastAsia="Consolas"/>
+                <w:color w:val="A31515"/>
+                <w:sz w:val="20"/>
+              </w:rPr>
+              <w:t>progress.updated_time</w:t>
+            </w:r>
+          </w:p>
+        </w:tc>
+        <w:tc>
+          <w:tcPr>
+            <w:tcW w:w="2065" w:type="dxa"/>
+          </w:tcPr>
+          <w:p>
+            <w:r>
+              <w:rPr>
+                <w:sz w:val="20"/>
+              </w:rPr>
+              <w:t>Thời điểm ISO-8601 (+07:00)</w:t>
+            </w:r>
+          </w:p>
+        </w:tc>
+        <w:tc>
+          <w:tcPr>
+            <w:tcW w:w="4701" w:type="dxa"/>
+          </w:tcPr>
+          <w:p>
+            <w:r>
+              <w:rPr>
+                <w:sz w:val="20"/>
+              </w:rPr>
+              <w:t>Lần cập nhật hồ sơ gần nhất</w:t>
+            </w:r>
+          </w:p>
+        </w:tc>
+      </w:tr>
+      <w:tr>
+        <w:tc>
+          <w:tcPr>
+            <w:tcW w:w="2922" w:type="dxa"/>
+          </w:tcPr>
+          <w:p>
+            <w:r>
+              <w:rPr>
+                <w:rFonts w:ascii="Consolas" w:hAnsi="Consolas" w:eastAsia="Consolas"/>
+                <w:color w:val="A31515"/>
+                <w:sz w:val="20"/>
+              </w:rPr>
+              <w:t>progress.documents[]</w:t>
+            </w:r>
+          </w:p>
+        </w:tc>
+        <w:tc>
+          <w:tcPr>
+            <w:tcW w:w="2065" w:type="dxa"/>
+          </w:tcPr>
+          <w:p>
+            <w:r>
+              <w:rPr>
+                <w:sz w:val="20"/>
+              </w:rPr>
+              <w:t>Mảng</w:t>
+            </w:r>
+          </w:p>
+        </w:tc>
+        <w:tc>
+          <w:tcPr>
+            <w:tcW w:w="4701" w:type="dxa"/>
+          </w:tcPr>
+          <w:p>
+            <w:r>
+              <w:rPr>
+                <w:sz w:val="20"/>
+              </w:rPr>
+              <w:t xml:space="preserve">Văn bản </w:t>
+            </w:r>
+            <w:r>
+              <w:rPr>
+                <w:b/>
+                <w:sz w:val="20"/>
+              </w:rPr>
+              <w:t>đã ban hành</w:t>
+            </w:r>
+            <w:r>
+              <w:rPr>
+                <w:sz w:val="20"/>
+              </w:rPr>
+              <w:t>, cũ trước; rỗng nếu chưa có. Mỗi loại văn bản chỉ lấy lần ban hành mới nhất</w:t>
+            </w:r>
+          </w:p>
+        </w:tc>
+      </w:tr>
+      <w:tr>
+        <w:tc>
+          <w:tcPr>
+            <w:tcW w:w="2922" w:type="dxa"/>
+          </w:tcPr>
+          <w:p>
+            <w:r>
+              <w:rPr>
+                <w:rFonts w:ascii="Consolas" w:hAnsi="Consolas" w:eastAsia="Consolas"/>
+                <w:color w:val="A31515"/>
+                <w:sz w:val="20"/>
+              </w:rPr>
+              <w:t>progress.documents[].type</w:t>
+            </w:r>
+          </w:p>
+        </w:tc>
+        <w:tc>
+          <w:tcPr>
+            <w:tcW w:w="2065" w:type="dxa"/>
+          </w:tcPr>
+          <w:p>
+            <w:r>
+              <w:rPr>
+                <w:sz w:val="20"/>
+              </w:rPr>
+              <w:t>Chuỗi</w:t>
+            </w:r>
+          </w:p>
+        </w:tc>
+        <w:tc>
+          <w:tcPr>
+            <w:tcW w:w="4701" w:type="dxa"/>
+          </w:tcPr>
+          <w:p>
+            <w:r>
+              <w:rPr>
+                <w:rFonts w:ascii="Consolas" w:hAnsi="Consolas" w:eastAsia="Consolas"/>
+                <w:color w:val="A31515"/>
+                <w:sz w:val="20"/>
+              </w:rPr>
+              <w:t>THONG_BAO_THU_LY</w:t>
+            </w:r>
+            <w:r>
+              <w:rPr>
+                <w:sz w:val="20"/>
+              </w:rPr>
+              <w:t xml:space="preserve">, </w:t>
+            </w:r>
+            <w:r>
+              <w:rPr>
+                <w:rFonts w:ascii="Consolas" w:hAnsi="Consolas" w:eastAsia="Consolas"/>
+                <w:color w:val="A31515"/>
+                <w:sz w:val="20"/>
+              </w:rPr>
+              <w:t>THONG_BAO_KHONG_THU_LY</w:t>
+            </w:r>
+            <w:r>
+              <w:rPr>
+                <w:sz w:val="20"/>
+              </w:rPr>
+              <w:t xml:space="preserve">, </w:t>
+            </w:r>
+            <w:r>
+              <w:rPr>
+                <w:rFonts w:ascii="Consolas" w:hAnsi="Consolas" w:eastAsia="Consolas"/>
+                <w:color w:val="A31515"/>
+                <w:sz w:val="20"/>
+              </w:rPr>
+              <w:t>YEU_CAU_BO_SUNG</w:t>
+            </w:r>
+            <w:r>
+              <w:rPr>
+                <w:sz w:val="20"/>
+              </w:rPr>
+              <w:t xml:space="preserve">, </w:t>
+            </w:r>
+            <w:r>
+              <w:rPr>
+                <w:rFonts w:ascii="Consolas" w:hAnsi="Consolas" w:eastAsia="Consolas"/>
+                <w:color w:val="A31515"/>
+                <w:sz w:val="20"/>
+              </w:rPr>
+              <w:t>DUNG_GIAI_QUYET</w:t>
+            </w:r>
+            <w:r>
+              <w:rPr>
+                <w:sz w:val="20"/>
+              </w:rPr>
+              <w:t xml:space="preserve">, </w:t>
+            </w:r>
+            <w:r>
+              <w:rPr>
+                <w:rFonts w:ascii="Consolas" w:hAnsi="Consolas" w:eastAsia="Consolas"/>
+                <w:color w:val="A31515"/>
+                <w:sz w:val="20"/>
+              </w:rPr>
+              <w:t>QUYET_DINH_GIAI_QUYET</w:t>
+            </w:r>
+          </w:p>
+        </w:tc>
+      </w:tr>
+      <w:tr>
+        <w:tc>
+          <w:tcPr>
+            <w:tcW w:w="2922" w:type="dxa"/>
+          </w:tcPr>
+          <w:p>
+            <w:r>
+              <w:rPr>
+                <w:rFonts w:ascii="Consolas" w:hAnsi="Consolas" w:eastAsia="Consolas"/>
+                <w:color w:val="A31515"/>
+                <w:sz w:val="20"/>
+              </w:rPr>
+              <w:t>progress.documents[].type_name</w:t>
+            </w:r>
+          </w:p>
+        </w:tc>
+        <w:tc>
+          <w:tcPr>
+            <w:tcW w:w="2065" w:type="dxa"/>
+          </w:tcPr>
+          <w:p>
+            <w:r>
+              <w:rPr>
+                <w:sz w:val="20"/>
+              </w:rPr>
+              <w:t>Chuỗi</w:t>
+            </w:r>
+          </w:p>
+        </w:tc>
+        <w:tc>
+          <w:tcPr>
+            <w:tcW w:w="4701" w:type="dxa"/>
+          </w:tcPr>
+          <w:p>
+            <w:r>
+              <w:rPr>
+                <w:sz w:val="20"/>
+              </w:rPr>
+              <w:t>Tên loại: Thông báo thụ lý (Mẫu 04); Thông báo không thụ lý; Văn bản yêu cầu bổ sung hồ sơ; Văn bản dừng giải quyết; Quyết định giải quyết bồi thường</w:t>
+            </w:r>
+          </w:p>
+        </w:tc>
+      </w:tr>
+      <w:tr>
+        <w:tc>
+          <w:tcPr>
+            <w:tcW w:w="2922" w:type="dxa"/>
+          </w:tcPr>
+          <w:p>
+            <w:r>
+              <w:rPr>
+                <w:rFonts w:ascii="Consolas" w:hAnsi="Consolas" w:eastAsia="Consolas"/>
+                <w:color w:val="A31515"/>
+                <w:sz w:val="20"/>
+              </w:rPr>
+              <w:t>progress.documents[].doc_no</w:t>
+            </w:r>
+          </w:p>
+        </w:tc>
+        <w:tc>
+          <w:tcPr>
+            <w:tcW w:w="2065" w:type="dxa"/>
+          </w:tcPr>
+          <w:p>
+            <w:r>
+              <w:rPr>
+                <w:sz w:val="20"/>
+              </w:rPr>
+              <w:t>Chuỗi</w:t>
+            </w:r>
+          </w:p>
+        </w:tc>
+        <w:tc>
+          <w:tcPr>
+            <w:tcW w:w="4701" w:type="dxa"/>
+          </w:tcPr>
+          <w:p>
+            <w:r>
+              <w:rPr>
+                <w:sz w:val="20"/>
+              </w:rPr>
+              <w:t>Số văn bản</w:t>
+            </w:r>
+          </w:p>
+        </w:tc>
+      </w:tr>
+      <w:tr>
+        <w:tc>
+          <w:tcPr>
+            <w:tcW w:w="2922" w:type="dxa"/>
+          </w:tcPr>
+          <w:p>
+            <w:r>
+              <w:rPr>
+                <w:rFonts w:ascii="Consolas" w:hAnsi="Consolas" w:eastAsia="Consolas"/>
+                <w:color w:val="A31515"/>
+                <w:sz w:val="20"/>
+              </w:rPr>
+              <w:t>progress.documents[].doc_date</w:t>
+            </w:r>
+          </w:p>
+        </w:tc>
+        <w:tc>
+          <w:tcPr>
+            <w:tcW w:w="2065" w:type="dxa"/>
+          </w:tcPr>
+          <w:p>
+            <w:r>
+              <w:rPr>
+                <w:sz w:val="20"/>
+              </w:rPr>
+              <w:t xml:space="preserve">Ngày </w:t>
+            </w:r>
+            <w:r>
+              <w:rPr>
+                <w:rFonts w:ascii="Consolas" w:hAnsi="Consolas" w:eastAsia="Consolas"/>
+                <w:color w:val="A31515"/>
+                <w:sz w:val="20"/>
+              </w:rPr>
+              <w:t>yyyy-MM-dd</w:t>
+            </w:r>
+          </w:p>
+        </w:tc>
+        <w:tc>
+          <w:tcPr>
+            <w:tcW w:w="4701" w:type="dxa"/>
+          </w:tcPr>
+          <w:p>
+            <w:r>
+              <w:rPr>
+                <w:sz w:val="20"/>
+              </w:rPr>
+              <w:t>Ngày văn bản</w:t>
+            </w:r>
+          </w:p>
+        </w:tc>
+      </w:tr>
+      <w:tr>
+        <w:tc>
+          <w:tcPr>
+            <w:tcW w:w="2922" w:type="dxa"/>
+          </w:tcPr>
+          <w:p>
+            <w:r>
+              <w:rPr>
+                <w:rFonts w:ascii="Consolas" w:hAnsi="Consolas" w:eastAsia="Consolas"/>
+                <w:color w:val="A31515"/>
+                <w:sz w:val="20"/>
+              </w:rPr>
+              <w:t>progress.documents[].issued_time</w:t>
+            </w:r>
+          </w:p>
+        </w:tc>
+        <w:tc>
+          <w:tcPr>
+            <w:tcW w:w="2065" w:type="dxa"/>
+          </w:tcPr>
+          <w:p>
+            <w:r>
+              <w:rPr>
+                <w:sz w:val="20"/>
+              </w:rPr>
+              <w:t>Thời điểm ISO-8601 (+07:00)</w:t>
+            </w:r>
+          </w:p>
+        </w:tc>
+        <w:tc>
+          <w:tcPr>
+            <w:tcW w:w="4701" w:type="dxa"/>
+          </w:tcPr>
+          <w:p>
+            <w:r>
+              <w:rPr>
+                <w:sz w:val="20"/>
+              </w:rPr>
+              <w:t>Thời điểm ban hành (cấp duyệt cuối; văn bản yêu cầu bổ sung: lúc phát hành)</w:t>
+            </w:r>
+          </w:p>
+        </w:tc>
+      </w:tr>
+    </w:tbl>
+    <w:p>
+      <w:r>
+        <w:t xml:space="preserve">Chỉ trả những gì người yêu cầu được biết: văn bản yêu cầu bổ sung và Quyết định giải quyết chỉ khi đã phát hành; không có ý kiến nội bộ, người duyệt, phiếu chờ duyệt hay dự thảo. </w:t>
+      </w:r>
+      <w:r>
+        <w:rPr>
+          <w:rFonts w:ascii="Consolas" w:hAnsi="Consolas" w:eastAsia="Consolas"/>
+          <w:color w:val="A31515"/>
+        </w:rPr>
+        <w:t>claim_status</w:t>
+      </w:r>
+      <w:r>
+        <w:t xml:space="preserve"> là trạng thái nội bộ của hồ sơ nên có thể là trạng thái trung gian (vd </w:t>
+      </w:r>
+      <w:r>
+        <w:rPr>
+          <w:rFonts w:ascii="Consolas" w:hAnsi="Consolas" w:eastAsia="Consolas"/>
+          <w:color w:val="A31515"/>
+        </w:rPr>
+        <w:t>CHO_PHAN_CONG</w:t>
+      </w:r>
+      <w:r>
+        <w:t xml:space="preserve">, </w:t>
+      </w:r>
+      <w:r>
+        <w:rPr>
+          <w:rFonts w:ascii="Consolas" w:hAnsi="Consolas" w:eastAsia="Consolas"/>
+          <w:color w:val="A31515"/>
+        </w:rPr>
+        <w:t>CHO_PHE_DUYET</w:t>
+      </w:r>
+      <w:r>
+        <w:t>).</w:t>
+      </w:r>
+    </w:p>
+    <w:p>
+      <w:r>
+        <w:t>Ví dụ phản hồi của hồ sơ đã được thụ lý:</w:t>
+      </w:r>
+    </w:p>
+    <w:p>
+      <w:pPr>
+        <w:shd w:val="clear" w:color="auto" w:fill="F2F4F7"/>
+        <w:spacing w:after="0" w:before="0"/>
+        <w:ind w:left="170"/>
+      </w:pPr>
+      <w:r>
+        <w:rPr>
+          <w:rFonts w:ascii="Consolas" w:hAnsi="Consolas" w:eastAsia="Consolas"/>
+          <w:sz w:val="17"/>
+        </w:rPr>
+        <w:t>{</w:t>
+      </w:r>
+    </w:p>
+    <w:p>
+      <w:pPr>
+        <w:shd w:val="clear" w:color="auto" w:fill="F2F4F7"/>
+        <w:spacing w:after="0" w:before="0"/>
+        <w:ind w:left="170"/>
+      </w:pPr>
+      <w:r>
+        <w:rPr>
+          <w:rFonts w:ascii="Consolas" w:hAnsi="Consolas" w:eastAsia="Consolas"/>
+          <w:sz w:val="17"/>
+        </w:rPr>
+        <w:t xml:space="preserve">  "code": "SUCCESS",</w:t>
+      </w:r>
+    </w:p>
+    <w:p>
+      <w:pPr>
+        <w:shd w:val="clear" w:color="auto" w:fill="F2F4F7"/>
+        <w:spacing w:after="0" w:before="0"/>
+        <w:ind w:left="170"/>
+      </w:pPr>
+      <w:r>
+        <w:rPr>
+          <w:rFonts w:ascii="Consolas" w:hAnsi="Consolas" w:eastAsia="Consolas"/>
+          <w:sz w:val="17"/>
+        </w:rPr>
+        <w:t xml:space="preserve">  "message": null,</w:t>
+      </w:r>
+    </w:p>
+    <w:p>
+      <w:pPr>
+        <w:shd w:val="clear" w:color="auto" w:fill="F2F4F7"/>
+        <w:spacing w:after="0" w:before="0"/>
+        <w:ind w:left="170"/>
+      </w:pPr>
+      <w:r>
+        <w:rPr>
+          <w:rFonts w:ascii="Consolas" w:hAnsi="Consolas" w:eastAsia="Consolas"/>
+          <w:sz w:val="17"/>
+        </w:rPr>
+        <w:t xml:space="preserve">  "data": {</w:t>
+      </w:r>
+    </w:p>
+    <w:p>
+      <w:pPr>
+        <w:shd w:val="clear" w:color="auto" w:fill="F2F4F7"/>
+        <w:spacing w:after="0" w:before="0"/>
+        <w:ind w:left="170"/>
+      </w:pPr>
+      <w:r>
+        <w:rPr>
+          <w:rFonts w:ascii="Consolas" w:hAnsi="Consolas" w:eastAsia="Consolas"/>
+          <w:sz w:val="17"/>
+        </w:rPr>
+        <w:t xml:space="preserve">    "dvc_dossier_code": "H48.12.2026.000123",</w:t>
+      </w:r>
+    </w:p>
+    <w:p>
+      <w:pPr>
+        <w:shd w:val="clear" w:color="auto" w:fill="F2F4F7"/>
+        <w:spacing w:after="0" w:before="0"/>
+        <w:ind w:left="170"/>
+      </w:pPr>
+      <w:r>
+        <w:rPr>
+          <w:rFonts w:ascii="Consolas" w:hAnsi="Consolas" w:eastAsia="Consolas"/>
+          <w:sz w:val="17"/>
+        </w:rPr>
+        <w:t xml:space="preserve">    "receipt_no": "API-20261027-000123",</w:t>
+      </w:r>
+    </w:p>
+    <w:p>
+      <w:pPr>
+        <w:shd w:val="clear" w:color="auto" w:fill="F2F4F7"/>
+        <w:spacing w:after="0" w:before="0"/>
+        <w:ind w:left="170"/>
+      </w:pPr>
+      <w:r>
+        <w:rPr>
+          <w:rFonts w:ascii="Consolas" w:hAnsi="Consolas" w:eastAsia="Consolas"/>
+          <w:sz w:val="17"/>
+        </w:rPr>
+        <w:t xml:space="preserve">    "status": "ACCEPTED",</w:t>
+      </w:r>
+    </w:p>
+    <w:p>
+      <w:pPr>
+        <w:shd w:val="clear" w:color="auto" w:fill="F2F4F7"/>
+        <w:spacing w:after="0" w:before="0"/>
+        <w:ind w:left="170"/>
+      </w:pPr>
+      <w:r>
+        <w:rPr>
+          <w:rFonts w:ascii="Consolas" w:hAnsi="Consolas" w:eastAsia="Consolas"/>
+          <w:sz w:val="17"/>
+        </w:rPr>
+        <w:t xml:space="preserve">    "status_name": "Đã chuyển vào màn Tiếp nhận của Hệ thống quản lý bồi thường nhà nước",</w:t>
+      </w:r>
+    </w:p>
+    <w:p>
+      <w:pPr>
+        <w:shd w:val="clear" w:color="auto" w:fill="F2F4F7"/>
+        <w:spacing w:after="0" w:before="0"/>
+        <w:ind w:left="170"/>
+      </w:pPr>
+      <w:r>
+        <w:rPr>
+          <w:rFonts w:ascii="Consolas" w:hAnsi="Consolas" w:eastAsia="Consolas"/>
+          <w:sz w:val="17"/>
+        </w:rPr>
+        <w:t xml:space="preserve">    "dossier_code": "BT-2026-007",</w:t>
+      </w:r>
+    </w:p>
+    <w:p>
+      <w:pPr>
+        <w:shd w:val="clear" w:color="auto" w:fill="F2F4F7"/>
+        <w:spacing w:after="0" w:before="0"/>
+        <w:ind w:left="170"/>
+      </w:pPr>
+      <w:r>
+        <w:rPr>
+          <w:rFonts w:ascii="Consolas" w:hAnsi="Consolas" w:eastAsia="Consolas"/>
+          <w:sz w:val="17"/>
+        </w:rPr>
+        <w:t xml:space="preserve">    "note": "Đã chuyển vào màn Tiếp nhận của Tòa án nhân dân tối cao, mã vụ việc VVBT-2026-012.",</w:t>
+      </w:r>
+    </w:p>
+    <w:p>
+      <w:pPr>
+        <w:shd w:val="clear" w:color="auto" w:fill="F2F4F7"/>
+        <w:spacing w:after="0" w:before="0"/>
+        <w:ind w:left="170"/>
+      </w:pPr>
+      <w:r>
+        <w:rPr>
+          <w:rFonts w:ascii="Consolas" w:hAnsi="Consolas" w:eastAsia="Consolas"/>
+          <w:sz w:val="17"/>
+        </w:rPr>
+        <w:t xml:space="preserve">    "received_time": "2026-10-27T09:30:05+07:00",</w:t>
+      </w:r>
+    </w:p>
+    <w:p>
+      <w:pPr>
+        <w:shd w:val="clear" w:color="auto" w:fill="F2F4F7"/>
+        <w:spacing w:after="0" w:before="0"/>
+        <w:ind w:left="170"/>
+      </w:pPr>
+      <w:r>
+        <w:rPr>
+          <w:rFonts w:ascii="Consolas" w:hAnsi="Consolas" w:eastAsia="Consolas"/>
+          <w:sz w:val="17"/>
+        </w:rPr>
+        <w:t xml:space="preserve">    "processed_time": "2026-10-27T09:31:02+07:00",</w:t>
+      </w:r>
+    </w:p>
+    <w:p>
+      <w:pPr>
+        <w:shd w:val="clear" w:color="auto" w:fill="F2F4F7"/>
+        <w:spacing w:after="0" w:before="0"/>
+        <w:ind w:left="170"/>
+      </w:pPr>
+      <w:r>
+        <w:rPr>
+          <w:rFonts w:ascii="Consolas" w:hAnsi="Consolas" w:eastAsia="Consolas"/>
+          <w:sz w:val="17"/>
+        </w:rPr>
+        <w:t xml:space="preserve">    "duplicate": false,</w:t>
+      </w:r>
+    </w:p>
+    <w:p>
+      <w:pPr>
+        <w:shd w:val="clear" w:color="auto" w:fill="F2F4F7"/>
+        <w:spacing w:after="0" w:before="0"/>
+        <w:ind w:left="170"/>
+      </w:pPr>
+      <w:r>
+        <w:rPr>
+          <w:rFonts w:ascii="Consolas" w:hAnsi="Consolas" w:eastAsia="Consolas"/>
+          <w:sz w:val="17"/>
+        </w:rPr>
+        <w:t xml:space="preserve">    "progress": {</w:t>
+      </w:r>
+    </w:p>
+    <w:p>
+      <w:pPr>
+        <w:shd w:val="clear" w:color="auto" w:fill="F2F4F7"/>
+        <w:spacing w:after="0" w:before="0"/>
+        <w:ind w:left="170"/>
+      </w:pPr>
+      <w:r>
+        <w:rPr>
+          <w:rFonts w:ascii="Consolas" w:hAnsi="Consolas" w:eastAsia="Consolas"/>
+          <w:sz w:val="17"/>
+        </w:rPr>
+        <w:t xml:space="preserve">      "claim_status": "DANG_XAC_MINH",</w:t>
+      </w:r>
+    </w:p>
+    <w:p>
+      <w:pPr>
+        <w:shd w:val="clear" w:color="auto" w:fill="F2F4F7"/>
+        <w:spacing w:after="0" w:before="0"/>
+        <w:ind w:left="170"/>
+      </w:pPr>
+      <w:r>
+        <w:rPr>
+          <w:rFonts w:ascii="Consolas" w:hAnsi="Consolas" w:eastAsia="Consolas"/>
+          <w:sz w:val="17"/>
+        </w:rPr>
+        <w:t xml:space="preserve">      "claim_status_name": "Đang xác minh thiệt hại",</w:t>
+      </w:r>
+    </w:p>
+    <w:p>
+      <w:pPr>
+        <w:shd w:val="clear" w:color="auto" w:fill="F2F4F7"/>
+        <w:spacing w:after="0" w:before="0"/>
+        <w:ind w:left="170"/>
+      </w:pPr>
+      <w:r>
+        <w:rPr>
+          <w:rFonts w:ascii="Consolas" w:hAnsi="Consolas" w:eastAsia="Consolas"/>
+          <w:sz w:val="17"/>
+        </w:rPr>
+        <w:t xml:space="preserve">      "updated_time": "2026-10-29T08:15:30+07:00",</w:t>
+      </w:r>
+    </w:p>
+    <w:p>
+      <w:pPr>
+        <w:shd w:val="clear" w:color="auto" w:fill="F2F4F7"/>
+        <w:spacing w:after="0" w:before="0"/>
+        <w:ind w:left="170"/>
+      </w:pPr>
+      <w:r>
+        <w:rPr>
+          <w:rFonts w:ascii="Consolas" w:hAnsi="Consolas" w:eastAsia="Consolas"/>
+          <w:sz w:val="17"/>
+        </w:rPr>
+        <w:t xml:space="preserve">      "documents": [</w:t>
+      </w:r>
+    </w:p>
+    <w:p>
+      <w:pPr>
+        <w:shd w:val="clear" w:color="auto" w:fill="F2F4F7"/>
+        <w:spacing w:after="0" w:before="0"/>
+        <w:ind w:left="170"/>
+      </w:pPr>
+      <w:r>
+        <w:rPr>
+          <w:rFonts w:ascii="Consolas" w:hAnsi="Consolas" w:eastAsia="Consolas"/>
+          <w:sz w:val="17"/>
+        </w:rPr>
+        <w:t xml:space="preserve">        {</w:t>
+      </w:r>
+    </w:p>
+    <w:p>
+      <w:pPr>
+        <w:shd w:val="clear" w:color="auto" w:fill="F2F4F7"/>
+        <w:spacing w:after="0" w:before="0"/>
+        <w:ind w:left="170"/>
+      </w:pPr>
+      <w:r>
+        <w:rPr>
+          <w:rFonts w:ascii="Consolas" w:hAnsi="Consolas" w:eastAsia="Consolas"/>
+          <w:sz w:val="17"/>
+        </w:rPr>
+        <w:t xml:space="preserve">          "type": "THONG_BAO_THU_LY",</w:t>
+      </w:r>
+    </w:p>
+    <w:p>
+      <w:pPr>
+        <w:shd w:val="clear" w:color="auto" w:fill="F2F4F7"/>
+        <w:spacing w:after="0" w:before="0"/>
+        <w:ind w:left="170"/>
+      </w:pPr>
+      <w:r>
+        <w:rPr>
+          <w:rFonts w:ascii="Consolas" w:hAnsi="Consolas" w:eastAsia="Consolas"/>
+          <w:sz w:val="17"/>
+        </w:rPr>
+        <w:t xml:space="preserve">          "type_name": "Thông báo thụ lý (Mẫu 04)",</w:t>
+      </w:r>
+    </w:p>
+    <w:p>
+      <w:pPr>
+        <w:shd w:val="clear" w:color="auto" w:fill="F2F4F7"/>
+        <w:spacing w:after="0" w:before="0"/>
+        <w:ind w:left="170"/>
+      </w:pPr>
+      <w:r>
+        <w:rPr>
+          <w:rFonts w:ascii="Consolas" w:hAnsi="Consolas" w:eastAsia="Consolas"/>
+          <w:sz w:val="17"/>
+        </w:rPr>
+        <w:t xml:space="preserve">          "doc_no": "12/TB-TLBT",</w:t>
+      </w:r>
+    </w:p>
+    <w:p>
+      <w:pPr>
+        <w:shd w:val="clear" w:color="auto" w:fill="F2F4F7"/>
+        <w:spacing w:after="0" w:before="0"/>
+        <w:ind w:left="170"/>
+      </w:pPr>
+      <w:r>
+        <w:rPr>
+          <w:rFonts w:ascii="Consolas" w:hAnsi="Consolas" w:eastAsia="Consolas"/>
+          <w:sz w:val="17"/>
+        </w:rPr>
+        <w:t xml:space="preserve">          "doc_date": "2026-10-28",</w:t>
+      </w:r>
+    </w:p>
+    <w:p>
+      <w:pPr>
+        <w:shd w:val="clear" w:color="auto" w:fill="F2F4F7"/>
+        <w:spacing w:after="0" w:before="0"/>
+        <w:ind w:left="170"/>
+      </w:pPr>
+      <w:r>
+        <w:rPr>
+          <w:rFonts w:ascii="Consolas" w:hAnsi="Consolas" w:eastAsia="Consolas"/>
+          <w:sz w:val="17"/>
+        </w:rPr>
+        <w:t xml:space="preserve">          "issued_time": "2026-10-28T16:40:00+07:00"</w:t>
+      </w:r>
+    </w:p>
+    <w:p>
+      <w:pPr>
+        <w:shd w:val="clear" w:color="auto" w:fill="F2F4F7"/>
+        <w:spacing w:after="0" w:before="0"/>
+        <w:ind w:left="170"/>
+      </w:pPr>
+      <w:r>
+        <w:rPr>
+          <w:rFonts w:ascii="Consolas" w:hAnsi="Consolas" w:eastAsia="Consolas"/>
+          <w:sz w:val="17"/>
+        </w:rPr>
+        <w:t xml:space="preserve">        }</w:t>
+      </w:r>
+    </w:p>
+    <w:p>
+      <w:pPr>
+        <w:shd w:val="clear" w:color="auto" w:fill="F2F4F7"/>
+        <w:spacing w:after="0" w:before="0"/>
+        <w:ind w:left="170"/>
+      </w:pPr>
+      <w:r>
+        <w:rPr>
+          <w:rFonts w:ascii="Consolas" w:hAnsi="Consolas" w:eastAsia="Consolas"/>
+          <w:sz w:val="17"/>
+        </w:rPr>
+        <w:t xml:space="preserve">      ]</w:t>
+      </w:r>
+    </w:p>
+    <w:p>
+      <w:pPr>
+        <w:shd w:val="clear" w:color="auto" w:fill="F2F4F7"/>
+        <w:spacing w:after="0" w:before="0"/>
+        <w:ind w:left="170"/>
+      </w:pPr>
+      <w:r>
+        <w:rPr>
+          <w:rFonts w:ascii="Consolas" w:hAnsi="Consolas" w:eastAsia="Consolas"/>
+          <w:sz w:val="17"/>
+        </w:rPr>
+        <w:t xml:space="preserve">    }</w:t>
+      </w:r>
+    </w:p>
+    <w:p>
+      <w:pPr>
+        <w:shd w:val="clear" w:color="auto" w:fill="F2F4F7"/>
+        <w:spacing w:after="0" w:before="0"/>
+        <w:ind w:left="170"/>
+      </w:pPr>
+      <w:r>
+        <w:rPr>
+          <w:rFonts w:ascii="Consolas" w:hAnsi="Consolas" w:eastAsia="Consolas"/>
+          <w:sz w:val="17"/>
+        </w:rPr>
+        <w:t xml:space="preserve">  }</w:t>
+      </w:r>
+    </w:p>
+    <w:p>
+      <w:pPr>
+        <w:shd w:val="clear" w:color="auto" w:fill="F2F4F7"/>
+        <w:spacing w:after="0" w:before="0"/>
+        <w:ind w:left="170"/>
+      </w:pPr>
+      <w:r>
+        <w:rPr>
+          <w:rFonts w:ascii="Consolas" w:hAnsi="Consolas" w:eastAsia="Consolas"/>
+          <w:sz w:val="17"/>
+        </w:rPr>
+        <w:t>}</w:t>
       </w:r>
     </w:p>
     <w:p>
@@ -19996,8 +21787,8 @@
       </w:tblPr>
       <w:tblGrid>
         <w:gridCol w:w="900"/>
-        <w:gridCol w:w="4178"/>
-        <w:gridCol w:w="4610"/>
+        <w:gridCol w:w="4163"/>
+        <w:gridCol w:w="4625"/>
       </w:tblGrid>
       <w:tr>
         <w:trPr>
@@ -20020,7 +21811,7 @@
         </w:tc>
         <w:tc>
           <w:tcPr>
-            <w:tcW w:w="4178" w:type="dxa"/>
+            <w:tcW w:w="4163" w:type="dxa"/>
             <w:shd w:val="clear" w:color="auto" w:fill="DCE6F2"/>
           </w:tcPr>
           <w:p>
@@ -20035,7 +21826,7 @@
         </w:tc>
         <w:tc>
           <w:tcPr>
-            <w:tcW w:w="4610" w:type="dxa"/>
+            <w:tcW w:w="4625" w:type="dxa"/>
             <w:shd w:val="clear" w:color="auto" w:fill="DCE6F2"/>
           </w:tcPr>
           <w:p>
@@ -20065,7 +21856,7 @@
         </w:tc>
         <w:tc>
           <w:tcPr>
-            <w:tcW w:w="4178" w:type="dxa"/>
+            <w:tcW w:w="4163" w:type="dxa"/>
           </w:tcPr>
           <w:p>
             <w:r>
@@ -20078,7 +21869,7 @@
         </w:tc>
         <w:tc>
           <w:tcPr>
-            <w:tcW w:w="4610" w:type="dxa"/>
+            <w:tcW w:w="4625" w:type="dxa"/>
           </w:tcPr>
           <w:p>
             <w:r>
@@ -20114,7 +21905,7 @@
         </w:tc>
         <w:tc>
           <w:tcPr>
-            <w:tcW w:w="4178" w:type="dxa"/>
+            <w:tcW w:w="4163" w:type="dxa"/>
           </w:tcPr>
           <w:p>
             <w:r>
@@ -20141,14 +21932,28 @@
         </w:tc>
         <w:tc>
           <w:tcPr>
-            <w:tcW w:w="4610" w:type="dxa"/>
-          </w:tcPr>
-          <w:p>
-            <w:r>
-              <w:rPr>
-                <w:sz w:val="20"/>
-              </w:rPr>
-              <w:t>HTTP 200</w:t>
+            <w:tcW w:w="4625" w:type="dxa"/>
+          </w:tcPr>
+          <w:p>
+            <w:r>
+              <w:rPr>
+                <w:sz w:val="20"/>
+              </w:rPr>
+              <w:t xml:space="preserve">HTTP 200, </w:t>
+            </w:r>
+            <w:r>
+              <w:rPr>
+                <w:rFonts w:ascii="Consolas" w:hAnsi="Consolas" w:eastAsia="Consolas"/>
+                <w:color w:val="A31515"/>
+                <w:sz w:val="20"/>
+              </w:rPr>
+              <w:t>data.server_time</w:t>
+            </w:r>
+            <w:r>
+              <w:rPr>
+                <w:sz w:val="20"/>
+              </w:rPr>
+              <w:t xml:space="preserve"> là giờ máy chủ</w:t>
             </w:r>
           </w:p>
         </w:tc>
@@ -20169,7 +21974,7 @@
         </w:tc>
         <w:tc>
           <w:tcPr>
-            <w:tcW w:w="4178" w:type="dxa"/>
+            <w:tcW w:w="4163" w:type="dxa"/>
           </w:tcPr>
           <w:p>
             <w:r>
@@ -20196,7 +22001,7 @@
         </w:tc>
         <w:tc>
           <w:tcPr>
-            <w:tcW w:w="4610" w:type="dxa"/>
+            <w:tcW w:w="4625" w:type="dxa"/>
           </w:tcPr>
           <w:p>
             <w:r>
@@ -20260,7 +22065,7 @@
         </w:tc>
         <w:tc>
           <w:tcPr>
-            <w:tcW w:w="4178" w:type="dxa"/>
+            <w:tcW w:w="4163" w:type="dxa"/>
           </w:tcPr>
           <w:p>
             <w:r>
@@ -20273,7 +22078,7 @@
         </w:tc>
         <w:tc>
           <w:tcPr>
-            <w:tcW w:w="4610" w:type="dxa"/>
+            <w:tcW w:w="4625" w:type="dxa"/>
           </w:tcPr>
           <w:p>
             <w:r>
@@ -20315,7 +22120,7 @@
         </w:tc>
         <w:tc>
           <w:tcPr>
-            <w:tcW w:w="4178" w:type="dxa"/>
+            <w:tcW w:w="4163" w:type="dxa"/>
           </w:tcPr>
           <w:p>
             <w:r>
@@ -20336,7 +22141,7 @@
         </w:tc>
         <w:tc>
           <w:tcPr>
-            <w:tcW w:w="4610" w:type="dxa"/>
+            <w:tcW w:w="4625" w:type="dxa"/>
           </w:tcPr>
           <w:p>
             <w:r>
@@ -20364,7 +22169,7 @@
         </w:tc>
         <w:tc>
           <w:tcPr>
-            <w:tcW w:w="4178" w:type="dxa"/>
+            <w:tcW w:w="4163" w:type="dxa"/>
           </w:tcPr>
           <w:p>
             <w:r>
@@ -20377,7 +22182,7 @@
         </w:tc>
         <w:tc>
           <w:tcPr>
-            <w:tcW w:w="4610" w:type="dxa"/>
+            <w:tcW w:w="4625" w:type="dxa"/>
           </w:tcPr>
           <w:p>
             <w:r>
@@ -20405,7 +22210,7 @@
         </w:tc>
         <w:tc>
           <w:tcPr>
-            <w:tcW w:w="4178" w:type="dxa"/>
+            <w:tcW w:w="4163" w:type="dxa"/>
           </w:tcPr>
           <w:p>
             <w:r>
@@ -20440,7 +22245,7 @@
         </w:tc>
         <w:tc>
           <w:tcPr>
-            <w:tcW w:w="4610" w:type="dxa"/>
+            <w:tcW w:w="4625" w:type="dxa"/>
           </w:tcPr>
           <w:p>
             <w:r>
@@ -20504,7 +22309,7 @@
         </w:tc>
         <w:tc>
           <w:tcPr>
-            <w:tcW w:w="4178" w:type="dxa"/>
+            <w:tcW w:w="4163" w:type="dxa"/>
           </w:tcPr>
           <w:p>
             <w:r>
@@ -20545,7 +22350,7 @@
         </w:tc>
         <w:tc>
           <w:tcPr>
-            <w:tcW w:w="4610" w:type="dxa"/>
+            <w:tcW w:w="4625" w:type="dxa"/>
           </w:tcPr>
           <w:p>
             <w:r>
@@ -20581,7 +22386,7 @@
         </w:tc>
         <w:tc>
           <w:tcPr>
-            <w:tcW w:w="4178" w:type="dxa"/>
+            <w:tcW w:w="4163" w:type="dxa"/>
           </w:tcPr>
           <w:p>
             <w:r>
@@ -20608,7 +22413,7 @@
         </w:tc>
         <w:tc>
           <w:tcPr>
-            <w:tcW w:w="4610" w:type="dxa"/>
+            <w:tcW w:w="4625" w:type="dxa"/>
           </w:tcPr>
           <w:p>
             <w:r>
@@ -20636,7 +22441,7 @@
         </w:tc>
         <w:tc>
           <w:tcPr>
-            <w:tcW w:w="4178" w:type="dxa"/>
+            <w:tcW w:w="4163" w:type="dxa"/>
           </w:tcPr>
           <w:p>
             <w:r>
@@ -20677,7 +22482,7 @@
         </w:tc>
         <w:tc>
           <w:tcPr>
-            <w:tcW w:w="4610" w:type="dxa"/>
+            <w:tcW w:w="4625" w:type="dxa"/>
           </w:tcPr>
           <w:p>
             <w:r>
@@ -20705,7 +22510,7 @@
         </w:tc>
         <w:tc>
           <w:tcPr>
-            <w:tcW w:w="4178" w:type="dxa"/>
+            <w:tcW w:w="4163" w:type="dxa"/>
           </w:tcPr>
           <w:p>
             <w:r>
@@ -20796,7 +22601,7 @@
         </w:tc>
         <w:tc>
           <w:tcPr>
-            <w:tcW w:w="4610" w:type="dxa"/>
+            <w:tcW w:w="4625" w:type="dxa"/>
           </w:tcPr>
           <w:p>
             <w:r>
@@ -20824,7 +22629,7 @@
         </w:tc>
         <w:tc>
           <w:tcPr>
-            <w:tcW w:w="4178" w:type="dxa"/>
+            <w:tcW w:w="4163" w:type="dxa"/>
           </w:tcPr>
           <w:p>
             <w:r>
@@ -20837,7 +22642,7 @@
         </w:tc>
         <w:tc>
           <w:tcPr>
-            <w:tcW w:w="4610" w:type="dxa"/>
+            <w:tcW w:w="4625" w:type="dxa"/>
           </w:tcPr>
           <w:p>
             <w:r>
@@ -20879,7 +22684,7 @@
         </w:tc>
         <w:tc>
           <w:tcPr>
-            <w:tcW w:w="4178" w:type="dxa"/>
+            <w:tcW w:w="4163" w:type="dxa"/>
           </w:tcPr>
           <w:p>
             <w:r>
@@ -20906,7 +22711,7 @@
         </w:tc>
         <w:tc>
           <w:tcPr>
-            <w:tcW w:w="4610" w:type="dxa"/>
+            <w:tcW w:w="4625" w:type="dxa"/>
           </w:tcPr>
           <w:p>
             <w:r>
@@ -20984,7 +22789,7 @@
         </w:tc>
         <w:tc>
           <w:tcPr>
-            <w:tcW w:w="4178" w:type="dxa"/>
+            <w:tcW w:w="4163" w:type="dxa"/>
           </w:tcPr>
           <w:p>
             <w:r>
@@ -21005,7 +22810,7 @@
         </w:tc>
         <w:tc>
           <w:tcPr>
-            <w:tcW w:w="4610" w:type="dxa"/>
+            <w:tcW w:w="4625" w:type="dxa"/>
           </w:tcPr>
           <w:p>
             <w:r>
@@ -21047,7 +22852,7 @@
         </w:tc>
         <w:tc>
           <w:tcPr>
-            <w:tcW w:w="4178" w:type="dxa"/>
+            <w:tcW w:w="4163" w:type="dxa"/>
           </w:tcPr>
           <w:p>
             <w:r>
@@ -21060,7 +22865,7 @@
         </w:tc>
         <w:tc>
           <w:tcPr>
-            <w:tcW w:w="4610" w:type="dxa"/>
+            <w:tcW w:w="4625" w:type="dxa"/>
           </w:tcPr>
           <w:p>
             <w:r>
@@ -21068,6 +22873,351 @@
                 <w:sz w:val="20"/>
               </w:rPr>
               <w:t>404</w:t>
+            </w:r>
+          </w:p>
+        </w:tc>
+      </w:tr>
+      <w:tr>
+        <w:tc>
+          <w:tcPr>
+            <w:tcW w:w="900" w:type="dxa"/>
+          </w:tcPr>
+          <w:p>
+            <w:r>
+              <w:rPr>
+                <w:sz w:val="20"/>
+              </w:rPr>
+              <w:t>16</w:t>
+            </w:r>
+          </w:p>
+        </w:tc>
+        <w:tc>
+          <w:tcPr>
+            <w:tcW w:w="4163" w:type="dxa"/>
+          </w:tcPr>
+          <w:p>
+            <w:r>
+              <w:rPr>
+                <w:sz w:val="20"/>
+              </w:rPr>
+              <w:t xml:space="preserve">Gọi </w:t>
+            </w:r>
+            <w:r>
+              <w:rPr>
+                <w:rFonts w:ascii="Consolas" w:hAnsi="Consolas" w:eastAsia="Consolas"/>
+                <w:color w:val="A31515"/>
+                <w:sz w:val="20"/>
+              </w:rPr>
+              <w:t>org-units</w:t>
+            </w:r>
+            <w:r>
+              <w:rPr>
+                <w:sz w:val="20"/>
+              </w:rPr>
+              <w:t xml:space="preserve"> với </w:t>
+            </w:r>
+            <w:r>
+              <w:rPr>
+                <w:rFonts w:ascii="Consolas" w:hAnsi="Consolas" w:eastAsia="Consolas"/>
+                <w:color w:val="A31515"/>
+                <w:sz w:val="20"/>
+              </w:rPr>
+              <w:t>province_code</w:t>
+            </w:r>
+            <w:r>
+              <w:rPr>
+                <w:sz w:val="20"/>
+              </w:rPr>
+              <w:t xml:space="preserve"> + </w:t>
+            </w:r>
+            <w:r>
+              <w:rPr>
+                <w:rFonts w:ascii="Consolas" w:hAnsi="Consolas" w:eastAsia="Consolas"/>
+                <w:color w:val="A31515"/>
+                <w:sz w:val="20"/>
+              </w:rPr>
+              <w:t>claim_intake_only=true</w:t>
+            </w:r>
+            <w:r>
+              <w:rPr>
+                <w:sz w:val="20"/>
+              </w:rPr>
+              <w:t xml:space="preserve">; gửi </w:t>
+            </w:r>
+            <w:r>
+              <w:rPr>
+                <w:rFonts w:ascii="Consolas" w:hAnsi="Consolas" w:eastAsia="Consolas"/>
+                <w:color w:val="A31515"/>
+                <w:sz w:val="20"/>
+              </w:rPr>
+              <w:t>claim_intake_only=abc</w:t>
+            </w:r>
+          </w:p>
+        </w:tc>
+        <w:tc>
+          <w:tcPr>
+            <w:tcW w:w="4625" w:type="dxa"/>
+          </w:tcPr>
+          <w:p>
+            <w:r>
+              <w:rPr>
+                <w:sz w:val="20"/>
+              </w:rPr>
+              <w:t xml:space="preserve">Chỉ đơn vị thuộc tỉnh đó và đã có Luồng tiếp nhận, </w:t>
+            </w:r>
+            <w:r>
+              <w:rPr>
+                <w:rFonts w:ascii="Consolas" w:hAnsi="Consolas" w:eastAsia="Consolas"/>
+                <w:color w:val="A31515"/>
+                <w:sz w:val="20"/>
+              </w:rPr>
+              <w:t>province_code</w:t>
+            </w:r>
+            <w:r>
+              <w:rPr>
+                <w:sz w:val="20"/>
+              </w:rPr>
+              <w:t xml:space="preserve"> mỗi dòng là tỉnh suy ra; giá trị sai: 400 </w:t>
+            </w:r>
+            <w:r>
+              <w:rPr>
+                <w:rFonts w:ascii="Consolas" w:hAnsi="Consolas" w:eastAsia="Consolas"/>
+                <w:color w:val="A31515"/>
+                <w:sz w:val="20"/>
+              </w:rPr>
+              <w:t>VALIDATION_ERROR</w:t>
+            </w:r>
+          </w:p>
+        </w:tc>
+      </w:tr>
+      <w:tr>
+        <w:tc>
+          <w:tcPr>
+            <w:tcW w:w="900" w:type="dxa"/>
+          </w:tcPr>
+          <w:p>
+            <w:r>
+              <w:rPr>
+                <w:sz w:val="20"/>
+              </w:rPr>
+              <w:t>17</w:t>
+            </w:r>
+          </w:p>
+        </w:tc>
+        <w:tc>
+          <w:tcPr>
+            <w:tcW w:w="4163" w:type="dxa"/>
+          </w:tcPr>
+          <w:p>
+            <w:r>
+              <w:rPr>
+                <w:sz w:val="20"/>
+              </w:rPr>
+              <w:t>Gửi hồ sơ tới cơ quan lấy từ ca 16, tra trạng thái trước và sau khi hồ sơ vào màn Tiếp nhận</w:t>
+            </w:r>
+          </w:p>
+        </w:tc>
+        <w:tc>
+          <w:tcPr>
+            <w:tcW w:w="4625" w:type="dxa"/>
+          </w:tcPr>
+          <w:p>
+            <w:r>
+              <w:rPr>
+                <w:rFonts w:ascii="Consolas" w:hAnsi="Consolas" w:eastAsia="Consolas"/>
+                <w:color w:val="A31515"/>
+                <w:sz w:val="20"/>
+              </w:rPr>
+              <w:t>RECEIVED</w:t>
+            </w:r>
+            <w:r>
+              <w:rPr>
+                <w:sz w:val="20"/>
+              </w:rPr>
+              <w:t xml:space="preserve"> với </w:t>
+            </w:r>
+            <w:r>
+              <w:rPr>
+                <w:rFonts w:ascii="Consolas" w:hAnsi="Consolas" w:eastAsia="Consolas"/>
+                <w:color w:val="A31515"/>
+                <w:sz w:val="20"/>
+              </w:rPr>
+              <w:t>progress</w:t>
+            </w:r>
+            <w:r>
+              <w:rPr>
+                <w:sz w:val="20"/>
+              </w:rPr>
+              <w:t xml:space="preserve"> = </w:t>
+            </w:r>
+            <w:r>
+              <w:rPr>
+                <w:rFonts w:ascii="Consolas" w:hAnsi="Consolas" w:eastAsia="Consolas"/>
+                <w:color w:val="A31515"/>
+                <w:sz w:val="20"/>
+              </w:rPr>
+              <w:t>null</w:t>
+            </w:r>
+            <w:r>
+              <w:rPr>
+                <w:sz w:val="20"/>
+              </w:rPr>
+              <w:t xml:space="preserve">; sau ~1 phút </w:t>
+            </w:r>
+            <w:r>
+              <w:rPr>
+                <w:rFonts w:ascii="Consolas" w:hAnsi="Consolas" w:eastAsia="Consolas"/>
+                <w:color w:val="A31515"/>
+                <w:sz w:val="20"/>
+              </w:rPr>
+              <w:t>ACCEPTED</w:t>
+            </w:r>
+            <w:r>
+              <w:rPr>
+                <w:sz w:val="20"/>
+              </w:rPr>
+              <w:t xml:space="preserve"> với </w:t>
+            </w:r>
+            <w:r>
+              <w:rPr>
+                <w:rFonts w:ascii="Consolas" w:hAnsi="Consolas" w:eastAsia="Consolas"/>
+                <w:color w:val="A31515"/>
+                <w:sz w:val="20"/>
+              </w:rPr>
+              <w:t>progress.claim_status</w:t>
+            </w:r>
+            <w:r>
+              <w:rPr>
+                <w:sz w:val="20"/>
+              </w:rPr>
+              <w:t xml:space="preserve">, </w:t>
+            </w:r>
+            <w:r>
+              <w:rPr>
+                <w:rFonts w:ascii="Consolas" w:hAnsi="Consolas" w:eastAsia="Consolas"/>
+                <w:color w:val="A31515"/>
+                <w:sz w:val="20"/>
+              </w:rPr>
+              <w:t>documents[]</w:t>
+            </w:r>
+            <w:r>
+              <w:rPr>
+                <w:sz w:val="20"/>
+              </w:rPr>
+              <w:t xml:space="preserve"> (rỗng đến khi BTNN ban hành văn bản)</w:t>
+            </w:r>
+          </w:p>
+        </w:tc>
+      </w:tr>
+      <w:tr>
+        <w:tc>
+          <w:tcPr>
+            <w:tcW w:w="900" w:type="dxa"/>
+          </w:tcPr>
+          <w:p>
+            <w:r>
+              <w:rPr>
+                <w:sz w:val="20"/>
+              </w:rPr>
+              <w:t>18</w:t>
+            </w:r>
+          </w:p>
+        </w:tc>
+        <w:tc>
+          <w:tcPr>
+            <w:tcW w:w="4163" w:type="dxa"/>
+          </w:tcPr>
+          <w:p>
+            <w:r>
+              <w:rPr>
+                <w:sz w:val="20"/>
+              </w:rPr>
+              <w:t>Sau khi BTNN ban hành Thông báo thụ lý, tra trạng thái</w:t>
+            </w:r>
+          </w:p>
+        </w:tc>
+        <w:tc>
+          <w:tcPr>
+            <w:tcW w:w="4625" w:type="dxa"/>
+          </w:tcPr>
+          <w:p>
+            <w:r>
+              <w:rPr>
+                <w:rFonts w:ascii="Consolas" w:hAnsi="Consolas" w:eastAsia="Consolas"/>
+                <w:color w:val="A31515"/>
+                <w:sz w:val="20"/>
+              </w:rPr>
+              <w:t>progress.documents[]</w:t>
+            </w:r>
+            <w:r>
+              <w:rPr>
+                <w:sz w:val="20"/>
+              </w:rPr>
+              <w:t xml:space="preserve"> có </w:t>
+            </w:r>
+            <w:r>
+              <w:rPr>
+                <w:rFonts w:ascii="Consolas" w:hAnsi="Consolas" w:eastAsia="Consolas"/>
+                <w:color w:val="A31515"/>
+                <w:sz w:val="20"/>
+              </w:rPr>
+              <w:t>type</w:t>
+            </w:r>
+            <w:r>
+              <w:rPr>
+                <w:sz w:val="20"/>
+              </w:rPr>
+              <w:t xml:space="preserve"> = </w:t>
+            </w:r>
+            <w:r>
+              <w:rPr>
+                <w:rFonts w:ascii="Consolas" w:hAnsi="Consolas" w:eastAsia="Consolas"/>
+                <w:color w:val="A31515"/>
+                <w:sz w:val="20"/>
+              </w:rPr>
+              <w:t>THONG_BAO_THU_LY</w:t>
+            </w:r>
+            <w:r>
+              <w:rPr>
+                <w:sz w:val="20"/>
+              </w:rPr>
+              <w:t xml:space="preserve"> kèm </w:t>
+            </w:r>
+            <w:r>
+              <w:rPr>
+                <w:rFonts w:ascii="Consolas" w:hAnsi="Consolas" w:eastAsia="Consolas"/>
+                <w:color w:val="A31515"/>
+                <w:sz w:val="20"/>
+              </w:rPr>
+              <w:t>doc_no</w:t>
+            </w:r>
+            <w:r>
+              <w:rPr>
+                <w:sz w:val="20"/>
+              </w:rPr>
+              <w:t xml:space="preserve">, </w:t>
+            </w:r>
+            <w:r>
+              <w:rPr>
+                <w:rFonts w:ascii="Consolas" w:hAnsi="Consolas" w:eastAsia="Consolas"/>
+                <w:color w:val="A31515"/>
+                <w:sz w:val="20"/>
+              </w:rPr>
+              <w:t>doc_date</w:t>
+            </w:r>
+            <w:r>
+              <w:rPr>
+                <w:sz w:val="20"/>
+              </w:rPr>
+              <w:t xml:space="preserve">, </w:t>
+            </w:r>
+            <w:r>
+              <w:rPr>
+                <w:rFonts w:ascii="Consolas" w:hAnsi="Consolas" w:eastAsia="Consolas"/>
+                <w:color w:val="A31515"/>
+                <w:sz w:val="20"/>
+              </w:rPr>
+              <w:t>issued_time</w:t>
             </w:r>
           </w:p>
         </w:tc>

</xml_diff>